<commit_message>
Stage 4D: Add RF engineering controls, STM32 TRM integration and persistent configuration
</commit_message>
<xml_diff>
--- a/docs/architecture/VX-MDD-001_Vanguard_X_Mission_Design_and_Description.docx
+++ b/docs/architecture/VX-MDD-001_Vanguard_X_Mission_Design_and_Description.docx
@@ -155,16 +155,8 @@
             <w:vAlign w:val="center"/>
           </w:tcPr>
           <w:p>
-            <w:pPr>
-              <w:spacing w:before="0" w:after="40"/>
-            </w:pPr>
-            <w:r>
-              <w:rPr>
-                <w:rFonts w:ascii="Calibri" w:hAnsi="Calibri"/>
-                <w:color w:val="000000"/>
-                <w:sz w:val="20"/>
-              </w:rPr>
-              <w:t>A - Initial design baseline</w:t>
+            <w:r>
+              <w:t>C - Runtime mode and SDR bench baseline</w:t>
             </w:r>
           </w:p>
         </w:tc>
@@ -212,16 +204,8 @@
             <w:vAlign w:val="center"/>
           </w:tcPr>
           <w:p>
-            <w:pPr>
-              <w:spacing w:before="0" w:after="40"/>
-            </w:pPr>
-            <w:r>
-              <w:rPr>
-                <w:rFonts w:ascii="Calibri" w:hAnsi="Calibri"/>
-                <w:color w:val="000000"/>
-                <w:sz w:val="20"/>
-              </w:rPr>
-              <w:t>23 July 2026</w:t>
+            <w:r>
+              <w:t>29 August 2026</w:t>
             </w:r>
           </w:p>
         </w:tc>
@@ -326,16 +310,8 @@
             <w:vAlign w:val="center"/>
           </w:tcPr>
           <w:p>
-            <w:pPr>
-              <w:spacing w:before="0" w:after="40"/>
-            </w:pPr>
-            <w:r>
-              <w:rPr>
-                <w:rFonts w:ascii="Calibri" w:hAnsi="Calibri"/>
-                <w:color w:val="000000"/>
-                <w:sz w:val="20"/>
-              </w:rPr>
-              <w:t>Design baseline for implementation and test</w:t>
+            <w:r>
+              <w:t>Implemented mission-interface baseline</w:t>
             </w:r>
           </w:p>
         </w:tc>
@@ -463,13 +439,13 @@
         <w:jc w:val="left"/>
         <w:tblLayout w:type="fixed"/>
         <w:tblLook w:firstColumn="1" w:firstRow="1" w:lastColumn="0" w:lastRow="0" w:noHBand="0" w:noVBand="1" w:val="04A0"/>
-        <w:tblInd w:w="120" w:type="dxa"/>
+        <w:tblInd w:w="0" w:type="dxa"/>
       </w:tblPr>
       <w:tblGrid>
-        <w:gridCol w:w="900"/>
-        <w:gridCol w:w="1500"/>
-        <w:gridCol w:w="5160"/>
-        <w:gridCol w:w="1800"/>
+        <w:gridCol w:w="1050"/>
+        <w:gridCol w:w="1450"/>
+        <w:gridCol w:w="5200"/>
+        <w:gridCol w:w="1660"/>
       </w:tblGrid>
       <w:tr>
         <w:trPr>
@@ -478,11 +454,11 @@
         </w:trPr>
         <w:tc>
           <w:tcPr>
-            <w:tcW w:type="dxa" w:w="900"/>
-            <w:tcMar>
-              <w:top w:w="80" w:type="dxa"/>
-              <w:start w:w="120" w:type="dxa"/>
-              <w:bottom w:w="80" w:type="dxa"/>
+            <w:tcW w:type="dxa" w:w="1050"/>
+            <w:tcMar>
+              <w:top w:w="90" w:type="dxa"/>
+              <w:start w:w="120" w:type="dxa"/>
+              <w:bottom w:w="90" w:type="dxa"/>
               <w:end w:w="120" w:type="dxa"/>
             </w:tcMar>
             <w:vAlign w:val="center"/>
@@ -505,11 +481,11 @@
         </w:tc>
         <w:tc>
           <w:tcPr>
-            <w:tcW w:type="dxa" w:w="1500"/>
-            <w:tcMar>
-              <w:top w:w="80" w:type="dxa"/>
-              <w:start w:w="120" w:type="dxa"/>
-              <w:bottom w:w="80" w:type="dxa"/>
+            <w:tcW w:type="dxa" w:w="1450"/>
+            <w:tcMar>
+              <w:top w:w="90" w:type="dxa"/>
+              <w:start w:w="120" w:type="dxa"/>
+              <w:bottom w:w="90" w:type="dxa"/>
               <w:end w:w="120" w:type="dxa"/>
             </w:tcMar>
             <w:vAlign w:val="center"/>
@@ -532,11 +508,11 @@
         </w:tc>
         <w:tc>
           <w:tcPr>
-            <w:tcW w:type="dxa" w:w="5160"/>
-            <w:tcMar>
-              <w:top w:w="80" w:type="dxa"/>
-              <w:start w:w="120" w:type="dxa"/>
-              <w:bottom w:w="80" w:type="dxa"/>
+            <w:tcW w:type="dxa" w:w="5200"/>
+            <w:tcMar>
+              <w:top w:w="90" w:type="dxa"/>
+              <w:start w:w="120" w:type="dxa"/>
+              <w:bottom w:w="90" w:type="dxa"/>
               <w:end w:w="120" w:type="dxa"/>
             </w:tcMar>
             <w:vAlign w:val="center"/>
@@ -559,11 +535,11 @@
         </w:tc>
         <w:tc>
           <w:tcPr>
-            <w:tcW w:type="dxa" w:w="1800"/>
-            <w:tcMar>
-              <w:top w:w="80" w:type="dxa"/>
-              <w:start w:w="120" w:type="dxa"/>
-              <w:bottom w:w="80" w:type="dxa"/>
+            <w:tcW w:type="dxa" w:w="1660"/>
+            <w:tcMar>
+              <w:top w:w="90" w:type="dxa"/>
+              <w:start w:w="120" w:type="dxa"/>
+              <w:bottom w:w="90" w:type="dxa"/>
               <w:end w:w="120" w:type="dxa"/>
             </w:tcMar>
             <w:vAlign w:val="center"/>
@@ -591,11 +567,11 @@
         </w:trPr>
         <w:tc>
           <w:tcPr>
-            <w:tcW w:type="dxa" w:w="900"/>
-            <w:tcMar>
-              <w:top w:w="80" w:type="dxa"/>
-              <w:start w:w="120" w:type="dxa"/>
-              <w:bottom w:w="80" w:type="dxa"/>
+            <w:tcW w:type="dxa" w:w="1050"/>
+            <w:tcMar>
+              <w:top w:w="90" w:type="dxa"/>
+              <w:start w:w="120" w:type="dxa"/>
+              <w:bottom w:w="90" w:type="dxa"/>
               <w:end w:w="120" w:type="dxa"/>
             </w:tcMar>
             <w:vAlign w:val="center"/>
@@ -616,11 +592,11 @@
         </w:tc>
         <w:tc>
           <w:tcPr>
-            <w:tcW w:type="dxa" w:w="1500"/>
-            <w:tcMar>
-              <w:top w:w="80" w:type="dxa"/>
-              <w:start w:w="120" w:type="dxa"/>
-              <w:bottom w:w="80" w:type="dxa"/>
+            <w:tcW w:type="dxa" w:w="1450"/>
+            <w:tcMar>
+              <w:top w:w="90" w:type="dxa"/>
+              <w:start w:w="120" w:type="dxa"/>
+              <w:bottom w:w="90" w:type="dxa"/>
               <w:end w:w="120" w:type="dxa"/>
             </w:tcMar>
             <w:vAlign w:val="center"/>
@@ -641,11 +617,11 @@
         </w:tc>
         <w:tc>
           <w:tcPr>
-            <w:tcW w:type="dxa" w:w="5160"/>
-            <w:tcMar>
-              <w:top w:w="80" w:type="dxa"/>
-              <w:start w:w="120" w:type="dxa"/>
-              <w:bottom w:w="80" w:type="dxa"/>
+            <w:tcW w:type="dxa" w:w="5200"/>
+            <w:tcMar>
+              <w:top w:w="90" w:type="dxa"/>
+              <w:start w:w="120" w:type="dxa"/>
+              <w:bottom w:w="90" w:type="dxa"/>
               <w:end w:w="120" w:type="dxa"/>
             </w:tcMar>
             <w:vAlign w:val="center"/>
@@ -666,11 +642,11 @@
         </w:tc>
         <w:tc>
           <w:tcPr>
-            <w:tcW w:type="dxa" w:w="1800"/>
-            <w:tcMar>
-              <w:top w:w="80" w:type="dxa"/>
-              <w:start w:w="120" w:type="dxa"/>
-              <w:bottom w:w="80" w:type="dxa"/>
+            <w:tcW w:type="dxa" w:w="1660"/>
+            <w:tcMar>
+              <w:top w:w="90" w:type="dxa"/>
+              <w:start w:w="120" w:type="dxa"/>
+              <w:bottom w:w="90" w:type="dxa"/>
               <w:end w:w="120" w:type="dxa"/>
             </w:tcMar>
             <w:vAlign w:val="center"/>
@@ -686,6 +662,134 @@
                 <w:sz w:val="18"/>
               </w:rPr>
               <w:t>Design baseline</w:t>
+            </w:r>
+          </w:p>
+        </w:tc>
+      </w:tr>
+      <w:tr>
+        <w:tc>
+          <w:tcPr>
+            <w:tcW w:type="dxa" w:w="1050"/>
+            <w:vAlign w:val="center"/>
+            <w:tcMar>
+              <w:top w:w="90" w:type="dxa"/>
+              <w:start w:w="120" w:type="dxa"/>
+              <w:bottom w:w="90" w:type="dxa"/>
+              <w:end w:w="120" w:type="dxa"/>
+            </w:tcMar>
+          </w:tcPr>
+          <w:p>
+            <w:pPr>
+              <w:spacing w:after="0"/>
+            </w:pPr>
+            <w:r>
+              <w:t>B</w:t>
+            </w:r>
+          </w:p>
+        </w:tc>
+        <w:tc>
+          <w:tcPr>
+            <w:tcW w:type="dxa" w:w="1450"/>
+            <w:vAlign w:val="center"/>
+            <w:tcMar>
+              <w:top w:w="90" w:type="dxa"/>
+              <w:start w:w="120" w:type="dxa"/>
+              <w:bottom w:w="90" w:type="dxa"/>
+              <w:end w:w="120" w:type="dxa"/>
+            </w:tcMar>
+          </w:tcPr>
+          <w:p>
+            <w:pPr>
+              <w:spacing w:after="0"/>
+            </w:pPr>
+            <w:r>
+              <w:t>24 Jul 2026</w:t>
+            </w:r>
+          </w:p>
+        </w:tc>
+        <w:tc>
+          <w:tcPr>
+            <w:tcW w:type="dxa" w:w="5200"/>
+            <w:vAlign w:val="center"/>
+            <w:tcMar>
+              <w:top w:w="90" w:type="dxa"/>
+              <w:start w:w="120" w:type="dxa"/>
+              <w:bottom w:w="90" w:type="dxa"/>
+              <w:end w:w="120" w:type="dxa"/>
+            </w:tcMar>
+          </w:tcPr>
+          <w:p>
+            <w:pPr>
+              <w:spacing w:after="0"/>
+            </w:pPr>
+            <w:r>
+              <w:t>Mission-tab implementation description, operator workflow, and UI figures</w:t>
+            </w:r>
+          </w:p>
+        </w:tc>
+        <w:tc>
+          <w:tcPr>
+            <w:tcW w:type="dxa" w:w="1660"/>
+            <w:vAlign w:val="center"/>
+            <w:tcMar>
+              <w:top w:w="90" w:type="dxa"/>
+              <w:start w:w="120" w:type="dxa"/>
+              <w:bottom w:w="90" w:type="dxa"/>
+              <w:end w:w="120" w:type="dxa"/>
+            </w:tcMar>
+          </w:tcPr>
+          <w:p>
+            <w:pPr>
+              <w:spacing w:after="0"/>
+            </w:pPr>
+            <w:r>
+              <w:t>Implemented baseline</w:t>
+            </w:r>
+          </w:p>
+        </w:tc>
+      </w:tr>
+      <w:tr>
+        <w:tc>
+          <w:tcPr>
+            <w:tcW w:type="dxa" w:w="1050"/>
+            <w:vAlign w:val="center"/>
+          </w:tcPr>
+          <w:p>
+            <w:r>
+              <w:t>C</w:t>
+            </w:r>
+          </w:p>
+        </w:tc>
+        <w:tc>
+          <w:tcPr>
+            <w:tcW w:type="dxa" w:w="1450"/>
+            <w:vAlign w:val="center"/>
+          </w:tcPr>
+          <w:p>
+            <w:r>
+              <w:t>29 Aug 2026</w:t>
+            </w:r>
+          </w:p>
+        </w:tc>
+        <w:tc>
+          <w:tcPr>
+            <w:tcW w:type="dxa" w:w="5200"/>
+            <w:vAlign w:val="center"/>
+          </w:tcPr>
+          <w:p>
+            <w:r>
+              <w:t>Clarified SIM/SDR/HARD/RF LOOPBACK runtime modes and incorporated SDR Bench / Golay ATR verification status.</w:t>
+            </w:r>
+          </w:p>
+        </w:tc>
+        <w:tc>
+          <w:tcPr>
+            <w:tcW w:type="dxa" w:w="1660"/>
+            <w:vAlign w:val="center"/>
+          </w:tcPr>
+          <w:p>
+            <w:r>
+              <w:t>Implemented baseline</w:t>
             </w:r>
           </w:p>
         </w:tc>
@@ -946,15 +1050,10 @@
           </w:tcPr>
           <w:p>
             <w:pPr>
-              <w:spacing w:before="0" w:after="40" w:line="252" w:lineRule="auto"/>
-            </w:pPr>
-            <w:r>
-              <w:rPr>
-                <w:rFonts w:ascii="Calibri" w:hAnsi="Calibri"/>
-                <w:color w:val="000000"/>
-                <w:sz w:val="18"/>
-              </w:rPr>
-              <w:t>Current single-page real-time display and Mission-tab integration baseline.</w:t>
+              <w:spacing w:before="0" w:after="0" w:line="252" w:lineRule="auto"/>
+            </w:pPr>
+            <w:r>
+              <w:t>Current tabbed Radar/Mission display and separated-UI link implementation baseline.</w:t>
             </w:r>
           </w:p>
         </w:tc>
@@ -3805,16 +3904,8 @@
             <w:vAlign w:val="center"/>
           </w:tcPr>
           <w:p>
-            <w:pPr>
-              <w:spacing w:before="0" w:after="40" w:line="252" w:lineRule="auto"/>
-            </w:pPr>
-            <w:r>
-              <w:rPr>
-                <w:rFonts w:ascii="Calibri" w:hAnsi="Calibri"/>
-                <w:color w:val="000000"/>
-                <w:sz w:val="18"/>
-              </w:rPr>
-              <w:t>Integer</w:t>
+            <w:r>
+              <w:t>Operational Golay default 64 physical A/B pulses</w:t>
             </w:r>
           </w:p>
         </w:tc>
@@ -3830,16 +3921,8 @@
             <w:vAlign w:val="center"/>
           </w:tcPr>
           <w:p>
-            <w:pPr>
-              <w:spacing w:before="0" w:after="40" w:line="252" w:lineRule="auto"/>
-            </w:pPr>
-            <w:r>
-              <w:rPr>
-                <w:rFonts w:ascii="Calibri" w:hAnsi="Calibri"/>
-                <w:color w:val="000000"/>
-                <w:sz w:val="18"/>
-              </w:rPr>
-              <w:t>Defines coherent integration and, with PRF, the CPI duration.</w:t>
+            <w:r>
+              <w:t>16 ms CPI at 4 kHz; 32 complementary pair outputs.</w:t>
             </w:r>
           </w:p>
         </w:tc>
@@ -9044,992 +9127,22 @@
     <w:p>
       <w:pPr>
         <w:pStyle w:val="Heading2"/>
+        <w:keepNext/>
       </w:pPr>
       <w:r>
-        <w:t>8.1 Display structure</w:t>
+        <w:t>8.1 Tabbed display structure and persistent status</w:t>
       </w:r>
     </w:p>
     <w:p>
+      <w:pPr/>
       <w:r>
-        <w:rPr>
-          <w:rFonts w:ascii="Calibri" w:hAnsi="Calibri"/>
-          <w:color w:val="000000"/>
-        </w:rPr>
-        <w:t>The current real-time PPI remains the operational Radar tab. Mission creation and validation are placed on a separate Mission tab so mission planning does not crowd or resize the polar plot or range profile. A compact persistent status header and STOP control remain visible from both tabs.</w:t>
-      </w:r>
-    </w:p>
-    <w:tbl>
-      <w:tblPr>
-        <w:tblStyle w:val="TableGrid"/>
-        <w:tblW w:type="dxa" w:w="9360"/>
-        <w:jc w:val="left"/>
-        <w:tblLayout w:type="fixed"/>
-        <w:tblLook w:firstColumn="1" w:firstRow="1" w:lastColumn="0" w:lastRow="0" w:noHBand="0" w:noVBand="1" w:val="04A0"/>
-        <w:tblInd w:w="120" w:type="dxa"/>
-      </w:tblPr>
-      <w:tblGrid>
-        <w:gridCol w:w="3120"/>
-        <w:gridCol w:w="3120"/>
-        <w:gridCol w:w="3120"/>
-      </w:tblGrid>
-      <w:tr>
-        <w:trPr>
-          <w:cantSplit/>
-          <w:tblHeader w:val="true"/>
-        </w:trPr>
-        <w:tc>
-          <w:tcPr>
-            <w:tcW w:type="dxa" w:w="3120"/>
-            <w:tcMar>
-              <w:top w:w="80" w:type="dxa"/>
-              <w:start w:w="120" w:type="dxa"/>
-              <w:bottom w:w="80" w:type="dxa"/>
-              <w:end w:w="120" w:type="dxa"/>
-            </w:tcMar>
-            <w:vAlign w:val="center"/>
-            <w:shd w:fill="E8EEF5"/>
-          </w:tcPr>
-          <w:p>
-            <w:pPr>
-              <w:spacing w:before="0" w:after="40" w:line="252" w:lineRule="auto"/>
-            </w:pPr>
-            <w:r>
-              <w:rPr>
-                <w:rFonts w:ascii="Calibri" w:hAnsi="Calibri"/>
-                <w:b/>
-                <w:color w:val="0B2545"/>
-                <w:sz w:val="18"/>
-              </w:rPr>
-              <w:t>Radar tab</w:t>
-            </w:r>
-          </w:p>
-        </w:tc>
-        <w:tc>
-          <w:tcPr>
-            <w:tcW w:type="dxa" w:w="3120"/>
-            <w:tcMar>
-              <w:top w:w="80" w:type="dxa"/>
-              <w:start w:w="120" w:type="dxa"/>
-              <w:bottom w:w="80" w:type="dxa"/>
-              <w:end w:w="120" w:type="dxa"/>
-            </w:tcMar>
-            <w:vAlign w:val="center"/>
-            <w:shd w:fill="E8EEF5"/>
-          </w:tcPr>
-          <w:p>
-            <w:pPr>
-              <w:spacing w:before="0" w:after="40" w:line="252" w:lineRule="auto"/>
-            </w:pPr>
-            <w:r>
-              <w:rPr>
-                <w:rFonts w:ascii="Calibri" w:hAnsi="Calibri"/>
-                <w:b/>
-                <w:color w:val="0B2545"/>
-                <w:sz w:val="18"/>
-              </w:rPr>
-              <w:t>Mission tab</w:t>
-            </w:r>
-          </w:p>
-        </w:tc>
-        <w:tc>
-          <w:tcPr>
-            <w:tcW w:type="dxa" w:w="3120"/>
-            <w:tcMar>
-              <w:top w:w="80" w:type="dxa"/>
-              <w:start w:w="120" w:type="dxa"/>
-              <w:bottom w:w="80" w:type="dxa"/>
-              <w:end w:w="120" w:type="dxa"/>
-            </w:tcMar>
-            <w:vAlign w:val="center"/>
-            <w:shd w:fill="E8EEF5"/>
-          </w:tcPr>
-          <w:p>
-            <w:pPr>
-              <w:spacing w:before="0" w:after="40" w:line="252" w:lineRule="auto"/>
-            </w:pPr>
-            <w:r>
-              <w:rPr>
-                <w:rFonts w:ascii="Calibri" w:hAnsi="Calibri"/>
-                <w:b/>
-                <w:color w:val="0B2545"/>
-                <w:sz w:val="18"/>
-              </w:rPr>
-              <w:t>Persistent header</w:t>
-            </w:r>
-          </w:p>
-        </w:tc>
-      </w:tr>
-      <w:tr>
-        <w:trPr>
-          <w:cantSplit/>
-        </w:trPr>
-        <w:tc>
-          <w:tcPr>
-            <w:tcW w:type="dxa" w:w="3120"/>
-            <w:tcMar>
-              <w:top w:w="80" w:type="dxa"/>
-              <w:start w:w="120" w:type="dxa"/>
-              <w:bottom w:w="80" w:type="dxa"/>
-              <w:end w:w="120" w:type="dxa"/>
-            </w:tcMar>
-            <w:vAlign w:val="center"/>
-          </w:tcPr>
-          <w:p>
-            <w:pPr>
-              <w:spacing w:before="0" w:after="40" w:line="252" w:lineRule="auto"/>
-            </w:pPr>
-            <w:r>
-              <w:rPr>
-                <w:rFonts w:ascii="Calibri" w:hAnsi="Calibri"/>
-                <w:color w:val="000000"/>
-                <w:sz w:val="18"/>
-              </w:rPr>
-              <w:t>North-up PPI; detections and tracks; selected-track details; range profile; live status; Tag/Untag Track.</w:t>
-            </w:r>
-          </w:p>
-        </w:tc>
-        <w:tc>
-          <w:tcPr>
-            <w:tcW w:type="dxa" w:w="3120"/>
-            <w:tcMar>
-              <w:top w:w="80" w:type="dxa"/>
-              <w:start w:w="120" w:type="dxa"/>
-              <w:bottom w:w="80" w:type="dxa"/>
-              <w:end w:w="120" w:type="dxa"/>
-            </w:tcMar>
-            <w:vAlign w:val="center"/>
-          </w:tcPr>
-          <w:p>
-            <w:pPr>
-              <w:spacing w:before="0" w:after="40" w:line="252" w:lineRule="auto"/>
-            </w:pPr>
-            <w:r>
-              <w:rPr>
-                <w:rFonts w:ascii="Calibri" w:hAnsi="Calibri"/>
-                <w:color w:val="000000"/>
-                <w:sz w:val="18"/>
-              </w:rPr>
-              <w:t>Mission identity; ordered task list; selected-task editor; Track Update policy; derived timing; validation results; Load/Start controls.</w:t>
-            </w:r>
-          </w:p>
-        </w:tc>
-        <w:tc>
-          <w:tcPr>
-            <w:tcW w:type="dxa" w:w="3120"/>
-            <w:tcMar>
-              <w:top w:w="80" w:type="dxa"/>
-              <w:start w:w="120" w:type="dxa"/>
-              <w:bottom w:w="80" w:type="dxa"/>
-              <w:end w:w="120" w:type="dxa"/>
-            </w:tcMar>
-            <w:vAlign w:val="center"/>
-          </w:tcPr>
-          <w:p>
-            <w:pPr>
-              <w:spacing w:before="0" w:after="40" w:line="252" w:lineRule="auto"/>
-            </w:pPr>
-            <w:r>
-              <w:rPr>
-                <w:rFonts w:ascii="Calibri" w:hAnsi="Calibri"/>
-                <w:color w:val="000000"/>
-                <w:sz w:val="18"/>
-              </w:rPr>
-              <w:t>System mode; TX/RX state; antenna azimuth; measured speed; active mission/task; warning/fault state; STOP.</w:t>
-            </w:r>
-          </w:p>
-        </w:tc>
-      </w:tr>
-    </w:tbl>
-    <w:p>
-      <w:pPr>
-        <w:spacing w:after="0"/>
-      </w:pPr>
-    </w:p>
-    <w:p>
-      <w:pPr>
-        <w:pStyle w:val="Heading2"/>
-      </w:pPr>
-      <w:r>
-        <w:t>8.2 Mission task list</w:t>
+        <w:t>The implemented Vanguard X operator display uses two tabs inside one application window. The Radar tab remains the live surveillance and control surface, while the Mission tab is the mission-authoring, validation, loading, and execution-control surface. This separation prevents mission-planning controls from reducing the PPI or range-profile area.</w:t>
       </w:r>
     </w:p>
     <w:p>
+      <w:pPr/>
       <w:r>
-        <w:rPr>
-          <w:rFonts w:ascii="Calibri" w:hAnsi="Calibri"/>
-          <w:color w:val="000000"/>
-        </w:rPr>
-        <w:t>The main Mission page presents an ordered task table. Operators can add a 360 Scan or Sector Scan, select a row for editing, enable/disable it, reorder it, duplicate it, or remove it. Track Update is shown as the third task type in a mission-wide interrupt panel because it does not occupy a fixed point in the primary sequence.</w:t>
-      </w:r>
-    </w:p>
-    <w:tbl>
-      <w:tblPr>
-        <w:tblStyle w:val="TableGrid"/>
-        <w:tblW w:type="dxa" w:w="9360"/>
-        <w:jc w:val="left"/>
-        <w:tblLayout w:type="fixed"/>
-        <w:tblLook w:firstColumn="1" w:firstRow="1" w:lastColumn="0" w:lastRow="0" w:noHBand="0" w:noVBand="1" w:val="04A0"/>
-        <w:tblInd w:w="120" w:type="dxa"/>
-      </w:tblPr>
-      <w:tblGrid>
-        <w:gridCol w:w="700"/>
-        <w:gridCol w:w="850"/>
-        <w:gridCol w:w="1400"/>
-        <w:gridCol w:w="1200"/>
-        <w:gridCol w:w="3710"/>
-        <w:gridCol w:w="1500"/>
-      </w:tblGrid>
-      <w:tr>
-        <w:trPr>
-          <w:cantSplit/>
-          <w:tblHeader w:val="true"/>
-        </w:trPr>
-        <w:tc>
-          <w:tcPr>
-            <w:tcW w:type="dxa" w:w="700"/>
-            <w:tcMar>
-              <w:top w:w="80" w:type="dxa"/>
-              <w:start w:w="120" w:type="dxa"/>
-              <w:bottom w:w="80" w:type="dxa"/>
-              <w:end w:w="120" w:type="dxa"/>
-            </w:tcMar>
-            <w:vAlign w:val="center"/>
-            <w:shd w:fill="E8EEF5"/>
-          </w:tcPr>
-          <w:p>
-            <w:pPr>
-              <w:spacing w:before="0" w:after="40" w:line="252" w:lineRule="auto"/>
-            </w:pPr>
-            <w:r>
-              <w:rPr>
-                <w:rFonts w:ascii="Calibri" w:hAnsi="Calibri"/>
-                <w:b/>
-                <w:color w:val="0B2545"/>
-                <w:sz w:val="17"/>
-              </w:rPr>
-              <w:t>Order</w:t>
-            </w:r>
-          </w:p>
-        </w:tc>
-        <w:tc>
-          <w:tcPr>
-            <w:tcW w:type="dxa" w:w="850"/>
-            <w:tcMar>
-              <w:top w:w="80" w:type="dxa"/>
-              <w:start w:w="120" w:type="dxa"/>
-              <w:bottom w:w="80" w:type="dxa"/>
-              <w:end w:w="120" w:type="dxa"/>
-            </w:tcMar>
-            <w:vAlign w:val="center"/>
-            <w:shd w:fill="E8EEF5"/>
-          </w:tcPr>
-          <w:p>
-            <w:pPr>
-              <w:spacing w:before="0" w:after="40" w:line="252" w:lineRule="auto"/>
-            </w:pPr>
-            <w:r>
-              <w:rPr>
-                <w:rFonts w:ascii="Calibri" w:hAnsi="Calibri"/>
-                <w:b/>
-                <w:color w:val="0B2545"/>
-                <w:sz w:val="17"/>
-              </w:rPr>
-              <w:t>Enabled</w:t>
-            </w:r>
-          </w:p>
-        </w:tc>
-        <w:tc>
-          <w:tcPr>
-            <w:tcW w:type="dxa" w:w="1400"/>
-            <w:tcMar>
-              <w:top w:w="80" w:type="dxa"/>
-              <w:start w:w="120" w:type="dxa"/>
-              <w:bottom w:w="80" w:type="dxa"/>
-              <w:end w:w="120" w:type="dxa"/>
-            </w:tcMar>
-            <w:vAlign w:val="center"/>
-            <w:shd w:fill="E8EEF5"/>
-          </w:tcPr>
-          <w:p>
-            <w:pPr>
-              <w:spacing w:before="0" w:after="40" w:line="252" w:lineRule="auto"/>
-            </w:pPr>
-            <w:r>
-              <w:rPr>
-                <w:rFonts w:ascii="Calibri" w:hAnsi="Calibri"/>
-                <w:b/>
-                <w:color w:val="0B2545"/>
-                <w:sz w:val="17"/>
-              </w:rPr>
-              <w:t>Task</w:t>
-            </w:r>
-          </w:p>
-        </w:tc>
-        <w:tc>
-          <w:tcPr>
-            <w:tcW w:type="dxa" w:w="1200"/>
-            <w:tcMar>
-              <w:top w:w="80" w:type="dxa"/>
-              <w:start w:w="120" w:type="dxa"/>
-              <w:bottom w:w="80" w:type="dxa"/>
-              <w:end w:w="120" w:type="dxa"/>
-            </w:tcMar>
-            <w:vAlign w:val="center"/>
-            <w:shd w:fill="E8EEF5"/>
-          </w:tcPr>
-          <w:p>
-            <w:pPr>
-              <w:spacing w:before="0" w:after="40" w:line="252" w:lineRule="auto"/>
-            </w:pPr>
-            <w:r>
-              <w:rPr>
-                <w:rFonts w:ascii="Calibri" w:hAnsi="Calibri"/>
-                <w:b/>
-                <w:color w:val="0B2545"/>
-                <w:sz w:val="17"/>
-              </w:rPr>
-              <w:t>Duration</w:t>
-            </w:r>
-          </w:p>
-        </w:tc>
-        <w:tc>
-          <w:tcPr>
-            <w:tcW w:type="dxa" w:w="3710"/>
-            <w:tcMar>
-              <w:top w:w="80" w:type="dxa"/>
-              <w:start w:w="120" w:type="dxa"/>
-              <w:bottom w:w="80" w:type="dxa"/>
-              <w:end w:w="120" w:type="dxa"/>
-            </w:tcMar>
-            <w:vAlign w:val="center"/>
-            <w:shd w:fill="E8EEF5"/>
-          </w:tcPr>
-          <w:p>
-            <w:pPr>
-              <w:spacing w:before="0" w:after="40" w:line="252" w:lineRule="auto"/>
-            </w:pPr>
-            <w:r>
-              <w:rPr>
-                <w:rFonts w:ascii="Calibri" w:hAnsi="Calibri"/>
-                <w:b/>
-                <w:color w:val="0B2545"/>
-                <w:sz w:val="17"/>
-              </w:rPr>
-              <w:t>Summary</w:t>
-            </w:r>
-          </w:p>
-        </w:tc>
-        <w:tc>
-          <w:tcPr>
-            <w:tcW w:type="dxa" w:w="1500"/>
-            <w:tcMar>
-              <w:top w:w="80" w:type="dxa"/>
-              <w:start w:w="120" w:type="dxa"/>
-              <w:bottom w:w="80" w:type="dxa"/>
-              <w:end w:w="120" w:type="dxa"/>
-            </w:tcMar>
-            <w:vAlign w:val="center"/>
-            <w:shd w:fill="E8EEF5"/>
-          </w:tcPr>
-          <w:p>
-            <w:pPr>
-              <w:spacing w:before="0" w:after="40" w:line="252" w:lineRule="auto"/>
-            </w:pPr>
-            <w:r>
-              <w:rPr>
-                <w:rFonts w:ascii="Calibri" w:hAnsi="Calibri"/>
-                <w:b/>
-                <w:color w:val="0B2545"/>
-                <w:sz w:val="17"/>
-              </w:rPr>
-              <w:t>Validation</w:t>
-            </w:r>
-          </w:p>
-        </w:tc>
-      </w:tr>
-      <w:tr>
-        <w:trPr>
-          <w:cantSplit/>
-        </w:trPr>
-        <w:tc>
-          <w:tcPr>
-            <w:tcW w:type="dxa" w:w="700"/>
-            <w:tcMar>
-              <w:top w:w="80" w:type="dxa"/>
-              <w:start w:w="120" w:type="dxa"/>
-              <w:bottom w:w="80" w:type="dxa"/>
-              <w:end w:w="120" w:type="dxa"/>
-            </w:tcMar>
-            <w:vAlign w:val="center"/>
-          </w:tcPr>
-          <w:p>
-            <w:pPr>
-              <w:spacing w:before="0" w:after="40" w:line="252" w:lineRule="auto"/>
-            </w:pPr>
-            <w:r>
-              <w:rPr>
-                <w:rFonts w:ascii="Calibri" w:hAnsi="Calibri"/>
-                <w:color w:val="000000"/>
-                <w:sz w:val="17"/>
-              </w:rPr>
-              <w:t>1</w:t>
-            </w:r>
-          </w:p>
-        </w:tc>
-        <w:tc>
-          <w:tcPr>
-            <w:tcW w:type="dxa" w:w="850"/>
-            <w:tcMar>
-              <w:top w:w="80" w:type="dxa"/>
-              <w:start w:w="120" w:type="dxa"/>
-              <w:bottom w:w="80" w:type="dxa"/>
-              <w:end w:w="120" w:type="dxa"/>
-            </w:tcMar>
-            <w:vAlign w:val="center"/>
-          </w:tcPr>
-          <w:p>
-            <w:pPr>
-              <w:spacing w:before="0" w:after="40" w:line="252" w:lineRule="auto"/>
-            </w:pPr>
-            <w:r>
-              <w:rPr>
-                <w:rFonts w:ascii="Calibri" w:hAnsi="Calibri"/>
-                <w:color w:val="000000"/>
-                <w:sz w:val="17"/>
-              </w:rPr>
-              <w:t>Yes</w:t>
-            </w:r>
-          </w:p>
-        </w:tc>
-        <w:tc>
-          <w:tcPr>
-            <w:tcW w:type="dxa" w:w="1400"/>
-            <w:tcMar>
-              <w:top w:w="80" w:type="dxa"/>
-              <w:start w:w="120" w:type="dxa"/>
-              <w:bottom w:w="80" w:type="dxa"/>
-              <w:end w:w="120" w:type="dxa"/>
-            </w:tcMar>
-            <w:vAlign w:val="center"/>
-          </w:tcPr>
-          <w:p>
-            <w:pPr>
-              <w:spacing w:before="0" w:after="40" w:line="252" w:lineRule="auto"/>
-            </w:pPr>
-            <w:r>
-              <w:rPr>
-                <w:rFonts w:ascii="Calibri" w:hAnsi="Calibri"/>
-                <w:color w:val="000000"/>
-                <w:sz w:val="17"/>
-              </w:rPr>
-              <w:t>360 Scan</w:t>
-            </w:r>
-          </w:p>
-        </w:tc>
-        <w:tc>
-          <w:tcPr>
-            <w:tcW w:type="dxa" w:w="1200"/>
-            <w:tcMar>
-              <w:top w:w="80" w:type="dxa"/>
-              <w:start w:w="120" w:type="dxa"/>
-              <w:bottom w:w="80" w:type="dxa"/>
-              <w:end w:w="120" w:type="dxa"/>
-            </w:tcMar>
-            <w:vAlign w:val="center"/>
-          </w:tcPr>
-          <w:p>
-            <w:pPr>
-              <w:spacing w:before="0" w:after="40" w:line="252" w:lineRule="auto"/>
-            </w:pPr>
-            <w:r>
-              <w:rPr>
-                <w:rFonts w:ascii="Calibri" w:hAnsi="Calibri"/>
-                <w:color w:val="000000"/>
-                <w:sz w:val="17"/>
-              </w:rPr>
-              <w:t>10 min</w:t>
-            </w:r>
-          </w:p>
-        </w:tc>
-        <w:tc>
-          <w:tcPr>
-            <w:tcW w:type="dxa" w:w="3710"/>
-            <w:tcMar>
-              <w:top w:w="80" w:type="dxa"/>
-              <w:start w:w="120" w:type="dxa"/>
-              <w:bottom w:w="80" w:type="dxa"/>
-              <w:end w:w="120" w:type="dxa"/>
-            </w:tcMar>
-            <w:vAlign w:val="center"/>
-          </w:tcPr>
-          <w:p>
-            <w:pPr>
-              <w:spacing w:before="0" w:after="40" w:line="252" w:lineRule="auto"/>
-            </w:pPr>
-            <w:r>
-              <w:rPr>
-                <w:rFonts w:ascii="Calibri" w:hAnsi="Calibri"/>
-                <w:color w:val="000000"/>
-                <w:sz w:val="17"/>
-              </w:rPr>
-              <w:t>24 RPM; Frank10; 2 kHz; 32 pulses</w:t>
-            </w:r>
-          </w:p>
-        </w:tc>
-        <w:tc>
-          <w:tcPr>
-            <w:tcW w:type="dxa" w:w="1500"/>
-            <w:tcMar>
-              <w:top w:w="80" w:type="dxa"/>
-              <w:start w:w="120" w:type="dxa"/>
-              <w:bottom w:w="80" w:type="dxa"/>
-              <w:end w:w="120" w:type="dxa"/>
-            </w:tcMar>
-            <w:vAlign w:val="center"/>
-          </w:tcPr>
-          <w:p>
-            <w:pPr>
-              <w:spacing w:before="0" w:after="40" w:line="252" w:lineRule="auto"/>
-            </w:pPr>
-            <w:r>
-              <w:rPr>
-                <w:rFonts w:ascii="Calibri" w:hAnsi="Calibri"/>
-                <w:color w:val="000000"/>
-                <w:sz w:val="17"/>
-              </w:rPr>
-              <w:t>Example only</w:t>
-            </w:r>
-          </w:p>
-        </w:tc>
-      </w:tr>
-      <w:tr>
-        <w:trPr>
-          <w:cantSplit/>
-        </w:trPr>
-        <w:tc>
-          <w:tcPr>
-            <w:tcW w:type="dxa" w:w="700"/>
-            <w:tcMar>
-              <w:top w:w="80" w:type="dxa"/>
-              <w:start w:w="120" w:type="dxa"/>
-              <w:bottom w:w="80" w:type="dxa"/>
-              <w:end w:w="120" w:type="dxa"/>
-            </w:tcMar>
-            <w:vAlign w:val="center"/>
-          </w:tcPr>
-          <w:p>
-            <w:pPr>
-              <w:spacing w:before="0" w:after="40" w:line="252" w:lineRule="auto"/>
-            </w:pPr>
-            <w:r>
-              <w:rPr>
-                <w:rFonts w:ascii="Calibri" w:hAnsi="Calibri"/>
-                <w:color w:val="000000"/>
-                <w:sz w:val="17"/>
-              </w:rPr>
-              <w:t>2</w:t>
-            </w:r>
-          </w:p>
-        </w:tc>
-        <w:tc>
-          <w:tcPr>
-            <w:tcW w:type="dxa" w:w="850"/>
-            <w:tcMar>
-              <w:top w:w="80" w:type="dxa"/>
-              <w:start w:w="120" w:type="dxa"/>
-              <w:bottom w:w="80" w:type="dxa"/>
-              <w:end w:w="120" w:type="dxa"/>
-            </w:tcMar>
-            <w:vAlign w:val="center"/>
-          </w:tcPr>
-          <w:p>
-            <w:pPr>
-              <w:spacing w:before="0" w:after="40" w:line="252" w:lineRule="auto"/>
-            </w:pPr>
-            <w:r>
-              <w:rPr>
-                <w:rFonts w:ascii="Calibri" w:hAnsi="Calibri"/>
-                <w:color w:val="000000"/>
-                <w:sz w:val="17"/>
-              </w:rPr>
-              <w:t>Yes</w:t>
-            </w:r>
-          </w:p>
-        </w:tc>
-        <w:tc>
-          <w:tcPr>
-            <w:tcW w:type="dxa" w:w="1400"/>
-            <w:tcMar>
-              <w:top w:w="80" w:type="dxa"/>
-              <w:start w:w="120" w:type="dxa"/>
-              <w:bottom w:w="80" w:type="dxa"/>
-              <w:end w:w="120" w:type="dxa"/>
-            </w:tcMar>
-            <w:vAlign w:val="center"/>
-          </w:tcPr>
-          <w:p>
-            <w:pPr>
-              <w:spacing w:before="0" w:after="40" w:line="252" w:lineRule="auto"/>
-            </w:pPr>
-            <w:r>
-              <w:rPr>
-                <w:rFonts w:ascii="Calibri" w:hAnsi="Calibri"/>
-                <w:color w:val="000000"/>
-                <w:sz w:val="17"/>
-              </w:rPr>
-              <w:t>Sector Scan</w:t>
-            </w:r>
-          </w:p>
-        </w:tc>
-        <w:tc>
-          <w:tcPr>
-            <w:tcW w:type="dxa" w:w="1200"/>
-            <w:tcMar>
-              <w:top w:w="80" w:type="dxa"/>
-              <w:start w:w="120" w:type="dxa"/>
-              <w:bottom w:w="80" w:type="dxa"/>
-              <w:end w:w="120" w:type="dxa"/>
-            </w:tcMar>
-            <w:vAlign w:val="center"/>
-          </w:tcPr>
-          <w:p>
-            <w:pPr>
-              <w:spacing w:before="0" w:after="40" w:line="252" w:lineRule="auto"/>
-            </w:pPr>
-            <w:r>
-              <w:rPr>
-                <w:rFonts w:ascii="Calibri" w:hAnsi="Calibri"/>
-                <w:color w:val="000000"/>
-                <w:sz w:val="17"/>
-              </w:rPr>
-              <w:t>20 min</w:t>
-            </w:r>
-          </w:p>
-        </w:tc>
-        <w:tc>
-          <w:tcPr>
-            <w:tcW w:type="dxa" w:w="3710"/>
-            <w:tcMar>
-              <w:top w:w="80" w:type="dxa"/>
-              <w:start w:w="120" w:type="dxa"/>
-              <w:bottom w:w="80" w:type="dxa"/>
-              <w:end w:w="120" w:type="dxa"/>
-            </w:tcMar>
-            <w:vAlign w:val="center"/>
-          </w:tcPr>
-          <w:p>
-            <w:pPr>
-              <w:spacing w:before="0" w:after="40" w:line="252" w:lineRule="auto"/>
-            </w:pPr>
-            <w:r>
-              <w:rPr>
-                <w:rFonts w:ascii="Calibri" w:hAnsi="Calibri"/>
-                <w:color w:val="000000"/>
-                <w:sz w:val="17"/>
-              </w:rPr>
-              <w:t>040-090 deg; Golay64; higher gain</w:t>
-            </w:r>
-          </w:p>
-        </w:tc>
-        <w:tc>
-          <w:tcPr>
-            <w:tcW w:type="dxa" w:w="1500"/>
-            <w:tcMar>
-              <w:top w:w="80" w:type="dxa"/>
-              <w:start w:w="120" w:type="dxa"/>
-              <w:bottom w:w="80" w:type="dxa"/>
-              <w:end w:w="120" w:type="dxa"/>
-            </w:tcMar>
-            <w:vAlign w:val="center"/>
-          </w:tcPr>
-          <w:p>
-            <w:pPr>
-              <w:spacing w:before="0" w:after="40" w:line="252" w:lineRule="auto"/>
-            </w:pPr>
-            <w:r>
-              <w:rPr>
-                <w:rFonts w:ascii="Calibri" w:hAnsi="Calibri"/>
-                <w:color w:val="000000"/>
-                <w:sz w:val="17"/>
-              </w:rPr>
-              <w:t>Example only</w:t>
-            </w:r>
-          </w:p>
-        </w:tc>
-      </w:tr>
-    </w:tbl>
-    <w:p>
-      <w:pPr>
-        <w:spacing w:after="0"/>
-      </w:pPr>
-    </w:p>
-    <w:p>
-      <w:pPr>
-        <w:pStyle w:val="Heading2"/>
-      </w:pPr>
-      <w:r>
-        <w:t>8.3 Selected-task editors</w:t>
-      </w:r>
-    </w:p>
-    <w:tbl>
-      <w:tblPr>
-        <w:tblStyle w:val="TableGrid"/>
-        <w:tblW w:type="dxa" w:w="9360"/>
-        <w:jc w:val="left"/>
-        <w:tblLayout w:type="fixed"/>
-        <w:tblLook w:firstColumn="1" w:firstRow="1" w:lastColumn="0" w:lastRow="0" w:noHBand="0" w:noVBand="1" w:val="04A0"/>
-        <w:tblInd w:w="120" w:type="dxa"/>
-      </w:tblPr>
-      <w:tblGrid>
-        <w:gridCol w:w="2100"/>
-        <w:gridCol w:w="7260"/>
-      </w:tblGrid>
-      <w:tr>
-        <w:trPr>
-          <w:cantSplit/>
-          <w:tblHeader w:val="true"/>
-        </w:trPr>
-        <w:tc>
-          <w:tcPr>
-            <w:tcW w:type="dxa" w:w="2100"/>
-            <w:tcMar>
-              <w:top w:w="80" w:type="dxa"/>
-              <w:start w:w="120" w:type="dxa"/>
-              <w:bottom w:w="80" w:type="dxa"/>
-              <w:end w:w="120" w:type="dxa"/>
-            </w:tcMar>
-            <w:vAlign w:val="center"/>
-            <w:shd w:fill="E8EEF5"/>
-          </w:tcPr>
-          <w:p>
-            <w:pPr>
-              <w:spacing w:before="0" w:after="40" w:line="252" w:lineRule="auto"/>
-            </w:pPr>
-            <w:r>
-              <w:rPr>
-                <w:rFonts w:ascii="Calibri" w:hAnsi="Calibri"/>
-                <w:b/>
-                <w:color w:val="0B2545"/>
-                <w:sz w:val="18"/>
-              </w:rPr>
-              <w:t>Panel</w:t>
-            </w:r>
-          </w:p>
-        </w:tc>
-        <w:tc>
-          <w:tcPr>
-            <w:tcW w:type="dxa" w:w="7260"/>
-            <w:tcMar>
-              <w:top w:w="80" w:type="dxa"/>
-              <w:start w:w="120" w:type="dxa"/>
-              <w:bottom w:w="80" w:type="dxa"/>
-              <w:end w:w="120" w:type="dxa"/>
-            </w:tcMar>
-            <w:vAlign w:val="center"/>
-            <w:shd w:fill="E8EEF5"/>
-          </w:tcPr>
-          <w:p>
-            <w:pPr>
-              <w:spacing w:before="0" w:after="40" w:line="252" w:lineRule="auto"/>
-            </w:pPr>
-            <w:r>
-              <w:rPr>
-                <w:rFonts w:ascii="Calibri" w:hAnsi="Calibri"/>
-                <w:b/>
-                <w:color w:val="0B2545"/>
-                <w:sz w:val="18"/>
-              </w:rPr>
-              <w:t>Controls</w:t>
-            </w:r>
-          </w:p>
-        </w:tc>
-      </w:tr>
-      <w:tr>
-        <w:trPr>
-          <w:cantSplit/>
-        </w:trPr>
-        <w:tc>
-          <w:tcPr>
-            <w:tcW w:type="dxa" w:w="2100"/>
-            <w:tcMar>
-              <w:top w:w="80" w:type="dxa"/>
-              <w:start w:w="120" w:type="dxa"/>
-              <w:bottom w:w="80" w:type="dxa"/>
-              <w:end w:w="120" w:type="dxa"/>
-            </w:tcMar>
-            <w:vAlign w:val="center"/>
-          </w:tcPr>
-          <w:p>
-            <w:pPr>
-              <w:spacing w:before="0" w:after="40" w:line="252" w:lineRule="auto"/>
-            </w:pPr>
-            <w:r>
-              <w:rPr>
-                <w:rFonts w:ascii="Calibri" w:hAnsi="Calibri"/>
-                <w:color w:val="000000"/>
-                <w:sz w:val="18"/>
-              </w:rPr>
-              <w:t>360 Scan</w:t>
-            </w:r>
-          </w:p>
-        </w:tc>
-        <w:tc>
-          <w:tcPr>
-            <w:tcW w:type="dxa" w:w="7260"/>
-            <w:tcMar>
-              <w:top w:w="80" w:type="dxa"/>
-              <w:start w:w="120" w:type="dxa"/>
-              <w:bottom w:w="80" w:type="dxa"/>
-              <w:end w:w="120" w:type="dxa"/>
-            </w:tcMar>
-            <w:vAlign w:val="center"/>
-          </w:tcPr>
-          <w:p>
-            <w:pPr>
-              <w:spacing w:before="0" w:after="40" w:line="252" w:lineRule="auto"/>
-            </w:pPr>
-            <w:r>
-              <w:rPr>
-                <w:rFonts w:ascii="Calibri" w:hAnsi="Calibri"/>
-                <w:color w:val="000000"/>
-                <w:sz w:val="18"/>
-              </w:rPr>
-              <w:t>Direction, RPM, waveform, PRF, pulses/CPI, maximum range, duration, completion action.</w:t>
-            </w:r>
-          </w:p>
-        </w:tc>
-      </w:tr>
-      <w:tr>
-        <w:trPr>
-          <w:cantSplit/>
-        </w:trPr>
-        <w:tc>
-          <w:tcPr>
-            <w:tcW w:type="dxa" w:w="2100"/>
-            <w:tcMar>
-              <w:top w:w="80" w:type="dxa"/>
-              <w:start w:w="120" w:type="dxa"/>
-              <w:bottom w:w="80" w:type="dxa"/>
-              <w:end w:w="120" w:type="dxa"/>
-            </w:tcMar>
-            <w:vAlign w:val="center"/>
-          </w:tcPr>
-          <w:p>
-            <w:pPr>
-              <w:spacing w:before="0" w:after="40" w:line="252" w:lineRule="auto"/>
-            </w:pPr>
-            <w:r>
-              <w:rPr>
-                <w:rFonts w:ascii="Calibri" w:hAnsi="Calibri"/>
-                <w:color w:val="000000"/>
-                <w:sz w:val="18"/>
-              </w:rPr>
-              <w:t>Sector Scan</w:t>
-            </w:r>
-          </w:p>
-        </w:tc>
-        <w:tc>
-          <w:tcPr>
-            <w:tcW w:type="dxa" w:w="7260"/>
-            <w:tcMar>
-              <w:top w:w="80" w:type="dxa"/>
-              <w:start w:w="120" w:type="dxa"/>
-              <w:bottom w:w="80" w:type="dxa"/>
-              <w:end w:w="120" w:type="dxa"/>
-            </w:tcMar>
-            <w:vAlign w:val="center"/>
-          </w:tcPr>
-          <w:p>
-            <w:pPr>
-              <w:spacing w:before="0" w:after="40" w:line="252" w:lineRule="auto"/>
-            </w:pPr>
-            <w:r>
-              <w:rPr>
-                <w:rFonts w:ascii="Calibri" w:hAnsi="Calibri"/>
-                <w:color w:val="000000"/>
-                <w:sz w:val="18"/>
-              </w:rPr>
-              <w:t>Start/stop bearing, initial direction, scan rate, endpoint margin, waveform, PRF, pulses/CPI, maximum range, duration.</w:t>
-            </w:r>
-          </w:p>
-        </w:tc>
-      </w:tr>
-      <w:tr>
-        <w:trPr>
-          <w:cantSplit/>
-        </w:trPr>
-        <w:tc>
-          <w:tcPr>
-            <w:tcW w:type="dxa" w:w="2100"/>
-            <w:tcMar>
-              <w:top w:w="80" w:type="dxa"/>
-              <w:start w:w="120" w:type="dxa"/>
-              <w:bottom w:w="80" w:type="dxa"/>
-              <w:end w:w="120" w:type="dxa"/>
-            </w:tcMar>
-            <w:vAlign w:val="center"/>
-          </w:tcPr>
-          <w:p>
-            <w:pPr>
-              <w:spacing w:before="0" w:after="40" w:line="252" w:lineRule="auto"/>
-            </w:pPr>
-            <w:r>
-              <w:rPr>
-                <w:rFonts w:ascii="Calibri" w:hAnsi="Calibri"/>
-                <w:color w:val="000000"/>
-                <w:sz w:val="18"/>
-              </w:rPr>
-              <w:t>Track Update</w:t>
-            </w:r>
-          </w:p>
-        </w:tc>
-        <w:tc>
-          <w:tcPr>
-            <w:tcW w:type="dxa" w:w="7260"/>
-            <w:tcMar>
-              <w:top w:w="80" w:type="dxa"/>
-              <w:start w:w="120" w:type="dxa"/>
-              <w:bottom w:w="80" w:type="dxa"/>
-              <w:end w:w="120" w:type="dxa"/>
-            </w:tcMar>
-            <w:vAlign w:val="center"/>
-          </w:tcPr>
-          <w:p>
-            <w:pPr>
-              <w:spacing w:before="0" w:after="40" w:line="252" w:lineRule="auto"/>
-            </w:pPr>
-            <w:r>
-              <w:rPr>
-                <w:rFonts w:ascii="Calibri" w:hAnsi="Calibri"/>
-                <w:color w:val="000000"/>
-                <w:sz w:val="18"/>
-              </w:rPr>
-              <w:t>Enabled, eligibility, revisit interval, waveform, PRF, pulses/CPI, gate sizing, angular step, dwells/angle, slew/nod rate, settle, timeout, miss policy.</w:t>
-            </w:r>
-          </w:p>
-        </w:tc>
-      </w:tr>
-    </w:tbl>
-    <w:p>
-      <w:pPr>
-        <w:spacing w:after="0"/>
-      </w:pPr>
-    </w:p>
-    <w:p>
-      <w:pPr>
-        <w:pStyle w:val="Heading2"/>
-      </w:pPr>
-      <w:r>
-        <w:t>8.4 Derived values and validation presentation</w:t>
-      </w:r>
-    </w:p>
-    <w:p>
-      <w:r>
-        <w:rPr>
-          <w:rFonts w:ascii="Calibri" w:hAnsi="Calibri"/>
-          <w:color w:val="000000"/>
-        </w:rPr>
-        <w:t>The UI shall calculate and show, without requiring the operator to derive them:</w:t>
+        <w:t>The following controls remain visible regardless of the selected tab:</w:t>
       </w:r>
     </w:p>
     <w:p>
@@ -10037,11 +9150,7 @@
         <w:pStyle w:val="ListBullet"/>
       </w:pPr>
       <w:r>
-        <w:rPr>
-          <w:rFonts w:ascii="Calibri" w:hAnsi="Calibri"/>
-          <w:color w:val="000000"/>
-        </w:rPr>
-        <w:t>CPI duration and pulse interval.</w:t>
+        <w:t>System mode and hardware state, including SIM, SDR Bench, HARD, or RF LOOPBACK context.</w:t>
       </w:r>
     </w:p>
     <w:p>
@@ -10049,11 +9158,7 @@
         <w:pStyle w:val="ListBullet"/>
       </w:pPr>
       <w:r>
-        <w:rPr>
-          <w:rFonts w:ascii="Calibri" w:hAnsi="Calibri"/>
-          <w:color w:val="000000"/>
-        </w:rPr>
-        <w:t>Degrees travelled during a CPI and between dwell starts.</w:t>
+        <w:t>Current operating state, RF authority or RX-only indication, and measured antenna azimuth.</w:t>
       </w:r>
     </w:p>
     <w:p>
@@ -10061,11 +9166,7 @@
         <w:pStyle w:val="ListBullet"/>
       </w:pPr>
       <w:r>
-        <w:rPr>
-          <w:rFonts w:ascii="Calibri" w:hAnsi="Calibri"/>
-          <w:color w:val="000000"/>
-        </w:rPr>
-        <w:t>Revolution time for 360 Scan.</w:t>
+        <w:t>Draft or active mission identity and the local/separated-display link state.</w:t>
       </w:r>
     </w:p>
     <w:p>
@@ -10073,466 +9174,515 @@
         <w:pStyle w:val="ListBullet"/>
       </w:pPr>
       <w:r>
-        <w:rPr>
-          <w:rFonts w:ascii="Calibri" w:hAnsi="Calibri"/>
-          <w:color w:val="000000"/>
-        </w:rPr>
-        <w:t>Sector width, traverse time, and expected revisit period for Sector Scan.</w:t>
+        <w:t>A prominent STOP control that remains available from both tabs.</w:t>
+      </w:r>
+    </w:p>
+    <w:p>
+      <w:pPr/>
+      <w:r>
+        <w:t xml:space="preserve">The operational Radar tab is shown in </w:t>
+      </w:r>
+      <w:r>
+        <w:t xml:space="preserve">Figure </w:t>
+      </w:r>
+      <w:fldChar w:fldCharType="begin"/>
+      <w:instrText xml:space="preserve"> REF fig_radar_tab </w:instrText>
+      <w:fldChar w:fldCharType="separate"/>
+      <w:r>
+        <w:t>1</w:t>
+      </w:r>
+      <w:fldChar w:fldCharType="end"/>
+      <w:r>
+        <w:t>. It retains the north-up PPI, live radar controls and status, selected-target panel, and range profile while sharing the persistent header with the Mission tab.</w:t>
       </w:r>
     </w:p>
     <w:p>
       <w:pPr>
-        <w:pStyle w:val="ListBullet"/>
+        <w:keepNext/>
+        <w:pageBreakBefore w:val="0"/>
+        <w:jc w:val="center"/>
       </w:pPr>
       <w:r>
-        <w:rPr>
-          <w:rFonts w:ascii="Calibri" w:hAnsi="Calibri"/>
-          <w:color w:val="000000"/>
-        </w:rPr>
-        <w:t>Estimated Track Update sample count, acquisition time, slew time, and total interruption time.</w:t>
+        <w:drawing>
+          <wp:inline xmlns:a="http://schemas.openxmlformats.org/drawingml/2006/main" xmlns:pic="http://schemas.openxmlformats.org/drawingml/2006/picture">
+            <wp:extent cx="5897880" cy="3938478"/>
+            <wp:docPr id="1" name="Picture 1" title="Vanguard X interface figure 1" descr="Screenshot of the Vanguard X Radar tab. A persistent header shows system HARD, STOP, RX ONLY, azimuth, draft mission and connected link. The main view contains the sector-scan PPI, radar controls, live radar status, selected target area and range profile."/>
+            <wp:cNvGraphicFramePr>
+              <a:graphicFrameLocks noChangeAspect="1"/>
+            </wp:cNvGraphicFramePr>
+            <a:graphic>
+              <a:graphicData uri="http://schemas.openxmlformats.org/drawingml/2006/picture">
+                <pic:pic>
+                  <pic:nvPicPr>
+                    <pic:cNvPr id="0" name="Screenshot from 2026-07-24 14-20-26(1).png"/>
+                    <pic:cNvPicPr/>
+                  </pic:nvPicPr>
+                  <pic:blipFill>
+                    <a:blip r:embed="rId11"/>
+                    <a:stretch>
+                      <a:fillRect/>
+                    </a:stretch>
+                  </pic:blipFill>
+                  <pic:spPr>
+                    <a:xfrm>
+                      <a:off x="0" y="0"/>
+                      <a:ext cx="5897880" cy="3938478"/>
+                    </a:xfrm>
+                    <a:prstGeom prst="rect"/>
+                  </pic:spPr>
+                </pic:pic>
+              </a:graphicData>
+            </a:graphic>
+          </wp:inline>
+        </w:drawing>
       </w:r>
     </w:p>
     <w:p>
       <w:pPr>
-        <w:pStyle w:val="ListBullet"/>
+        <w:pStyle w:val="Caption"/>
+        <w:keepNext w:val="0"/>
+        <w:jc w:val="center"/>
       </w:pPr>
       <w:r>
-        <w:rPr>
-          <w:rFonts w:ascii="Calibri" w:hAnsi="Calibri"/>
-          <w:color w:val="000000"/>
-        </w:rPr>
-        <w:t>Requested versus earliest/effective track revisit interval.</w:t>
+        <w:t xml:space="preserve">Figure </w:t>
+      </w:r>
+      <w:bookmarkStart w:id="101" w:name="fig_radar_tab"/>
+      <w:fldChar w:fldCharType="begin"/>
+      <w:instrText xml:space="preserve"> SEQ Figure </w:instrText>
+      <w:fldChar w:fldCharType="separate"/>
+      <w:r>
+        <w:t>1</w:t>
+      </w:r>
+      <w:fldChar w:fldCharType="end"/>
+      <w:bookmarkEnd w:id="101"/>
+      <w:r>
+        <w:t>. Vanguard X Radar tab with the persistent system-status header, live PPI, radar controls, selected-target panel, and range profile.</w:t>
       </w:r>
     </w:p>
     <w:p>
       <w:pPr>
-        <w:pStyle w:val="ListBullet"/>
+        <w:pStyle w:val="Heading2"/>
+        <w:keepNext/>
       </w:pPr>
       <w:r>
-        <w:rPr>
-          <w:rFonts w:ascii="Calibri" w:hAnsi="Calibri"/>
-          <w:color w:val="000000"/>
-        </w:rPr>
-        <w:t>Estimated dwells per usable beamwidth and any angular coverage gaps.</w:t>
+        <w:t>8.2 Mission tab layout</w:t>
+      </w:r>
+    </w:p>
+    <w:p>
+      <w:pPr/>
+      <w:r>
+        <w:t xml:space="preserve">The implemented Mission tab is shown in </w:t>
+      </w:r>
+      <w:r>
+        <w:t xml:space="preserve">Figure </w:t>
+      </w:r>
+      <w:fldChar w:fldCharType="begin"/>
+      <w:instrText xml:space="preserve"> REF fig_mission_tab </w:instrText>
+      <w:fldChar w:fldCharType="separate"/>
+      <w:r>
+        <w:t>2</w:t>
+      </w:r>
+      <w:fldChar w:fldCharType="end"/>
+      <w:r>
+        <w:t>. It is arranged as five functional regions so that an operator can construct and verify a mission without directly commanding RF or antenna hardware.</w:t>
       </w:r>
     </w:p>
     <w:tbl>
       <w:tblPr>
         <w:tblStyle w:val="TableGrid"/>
         <w:tblW w:type="dxa" w:w="9360"/>
-        <w:jc w:val="left"/>
         <w:tblLayout w:type="fixed"/>
         <w:tblLook w:firstColumn="1" w:firstRow="1" w:lastColumn="0" w:lastRow="0" w:noHBand="0" w:noVBand="1" w:val="04A0"/>
-        <w:tblInd w:w="120" w:type="dxa"/>
+        <w:tblInd w:w="0" w:type="dxa"/>
       </w:tblPr>
       <w:tblGrid>
-        <w:gridCol w:w="1500"/>
-        <w:gridCol w:w="4500"/>
-        <w:gridCol w:w="3360"/>
+        <w:gridCol w:w="1700"/>
+        <w:gridCol w:w="4050"/>
+        <w:gridCol w:w="3610"/>
       </w:tblGrid>
       <w:tr>
         <w:trPr>
-          <w:cantSplit/>
           <w:tblHeader w:val="true"/>
         </w:trPr>
         <w:tc>
           <w:tcPr>
-            <w:tcW w:type="dxa" w:w="1500"/>
-            <w:tcMar>
-              <w:top w:w="80" w:type="dxa"/>
-              <w:start w:w="120" w:type="dxa"/>
-              <w:bottom w:w="80" w:type="dxa"/>
-              <w:end w:w="120" w:type="dxa"/>
-            </w:tcMar>
-            <w:vAlign w:val="center"/>
-            <w:shd w:fill="E8EEF5"/>
-          </w:tcPr>
-          <w:p>
-            <w:pPr>
-              <w:spacing w:before="0" w:after="40" w:line="252" w:lineRule="auto"/>
-            </w:pPr>
-            <w:r>
-              <w:rPr>
-                <w:rFonts w:ascii="Calibri" w:hAnsi="Calibri"/>
+            <w:tcW w:type="dxa" w:w="1700"/>
+            <w:vAlign w:val="center"/>
+            <w:tcMar>
+              <w:top w:w="90" w:type="dxa"/>
+              <w:start w:w="120" w:type="dxa"/>
+              <w:bottom w:w="90" w:type="dxa"/>
+              <w:end w:w="120" w:type="dxa"/>
+            </w:tcMar>
+            <w:shd w:fill="D9E2F3"/>
+          </w:tcPr>
+          <w:p>
+            <w:pPr>
+              <w:spacing w:after="0"/>
+            </w:pPr>
+            <w:r>
+              <w:rPr>
                 <w:b/>
-                <w:color w:val="0B2545"/>
-                <w:sz w:val="18"/>
-              </w:rPr>
-              <w:t>Severity</w:t>
-            </w:r>
-          </w:p>
-        </w:tc>
-        <w:tc>
-          <w:tcPr>
-            <w:tcW w:type="dxa" w:w="4500"/>
-            <w:tcMar>
-              <w:top w:w="80" w:type="dxa"/>
-              <w:start w:w="120" w:type="dxa"/>
-              <w:bottom w:w="80" w:type="dxa"/>
-              <w:end w:w="120" w:type="dxa"/>
-            </w:tcMar>
-            <w:vAlign w:val="center"/>
-            <w:shd w:fill="E8EEF5"/>
-          </w:tcPr>
-          <w:p>
-            <w:pPr>
-              <w:spacing w:before="0" w:after="40" w:line="252" w:lineRule="auto"/>
-            </w:pPr>
-            <w:r>
-              <w:rPr>
-                <w:rFonts w:ascii="Calibri" w:hAnsi="Calibri"/>
+              </w:rPr>
+              <w:t>Region</w:t>
+            </w:r>
+          </w:p>
+        </w:tc>
+        <w:tc>
+          <w:tcPr>
+            <w:tcW w:type="dxa" w:w="4050"/>
+            <w:vAlign w:val="center"/>
+            <w:tcMar>
+              <w:top w:w="90" w:type="dxa"/>
+              <w:start w:w="120" w:type="dxa"/>
+              <w:bottom w:w="90" w:type="dxa"/>
+              <w:end w:w="120" w:type="dxa"/>
+            </w:tcMar>
+            <w:shd w:fill="D9E2F3"/>
+          </w:tcPr>
+          <w:p>
+            <w:pPr>
+              <w:spacing w:after="0"/>
+            </w:pPr>
+            <w:r>
+              <w:rPr>
                 <w:b/>
-                <w:color w:val="0B2545"/>
-                <w:sz w:val="18"/>
-              </w:rPr>
-              <w:t>UI treatment</w:t>
-            </w:r>
-          </w:p>
-        </w:tc>
-        <w:tc>
-          <w:tcPr>
-            <w:tcW w:type="dxa" w:w="3360"/>
-            <w:tcMar>
-              <w:top w:w="80" w:type="dxa"/>
-              <w:start w:w="120" w:type="dxa"/>
-              <w:bottom w:w="80" w:type="dxa"/>
-              <w:end w:w="120" w:type="dxa"/>
-            </w:tcMar>
-            <w:vAlign w:val="center"/>
-            <w:shd w:fill="E8EEF5"/>
-          </w:tcPr>
-          <w:p>
-            <w:pPr>
-              <w:spacing w:before="0" w:after="40" w:line="252" w:lineRule="auto"/>
-            </w:pPr>
-            <w:r>
-              <w:rPr>
-                <w:rFonts w:ascii="Calibri" w:hAnsi="Calibri"/>
+              </w:rPr>
+              <w:t>Displayed content</w:t>
+            </w:r>
+          </w:p>
+        </w:tc>
+        <w:tc>
+          <w:tcPr>
+            <w:tcW w:type="dxa" w:w="3610"/>
+            <w:vAlign w:val="center"/>
+            <w:tcMar>
+              <w:top w:w="90" w:type="dxa"/>
+              <w:start w:w="120" w:type="dxa"/>
+              <w:bottom w:w="90" w:type="dxa"/>
+              <w:end w:w="120" w:type="dxa"/>
+            </w:tcMar>
+            <w:shd w:fill="D9E2F3"/>
+          </w:tcPr>
+          <w:p>
+            <w:pPr>
+              <w:spacing w:after="0"/>
+            </w:pPr>
+            <w:r>
+              <w:rPr>
                 <w:b/>
-                <w:color w:val="0B2545"/>
-                <w:sz w:val="18"/>
-              </w:rPr>
-              <w:t>Execution effect</w:t>
+              </w:rPr>
+              <w:t>System role</w:t>
             </w:r>
           </w:p>
         </w:tc>
       </w:tr>
       <w:tr>
-        <w:trPr>
-          <w:cantSplit/>
-        </w:trPr>
-        <w:tc>
-          <w:tcPr>
-            <w:tcW w:type="dxa" w:w="1500"/>
-            <w:tcMar>
-              <w:top w:w="80" w:type="dxa"/>
-              <w:start w:w="120" w:type="dxa"/>
-              <w:bottom w:w="80" w:type="dxa"/>
-              <w:end w:w="120" w:type="dxa"/>
-            </w:tcMar>
-            <w:vAlign w:val="center"/>
-          </w:tcPr>
-          <w:p>
-            <w:pPr>
-              <w:spacing w:before="0" w:after="40" w:line="252" w:lineRule="auto"/>
-            </w:pPr>
-            <w:r>
-              <w:rPr>
-                <w:rFonts w:ascii="Calibri" w:hAnsi="Calibri"/>
-                <w:color w:val="000000"/>
-                <w:sz w:val="18"/>
-              </w:rPr>
-              <w:t>Information</w:t>
-            </w:r>
-          </w:p>
-        </w:tc>
-        <w:tc>
-          <w:tcPr>
-            <w:tcW w:type="dxa" w:w="4500"/>
-            <w:tcMar>
-              <w:top w:w="80" w:type="dxa"/>
-              <w:start w:w="120" w:type="dxa"/>
-              <w:bottom w:w="80" w:type="dxa"/>
-              <w:end w:w="120" w:type="dxa"/>
-            </w:tcMar>
-            <w:vAlign w:val="center"/>
-          </w:tcPr>
-          <w:p>
-            <w:pPr>
-              <w:spacing w:before="0" w:after="40" w:line="252" w:lineRule="auto"/>
-            </w:pPr>
-            <w:r>
-              <w:rPr>
-                <w:rFonts w:ascii="Calibri" w:hAnsi="Calibri"/>
-                <w:color w:val="000000"/>
-                <w:sz w:val="18"/>
-              </w:rPr>
-              <w:t>Neutral derived value or recommendation</w:t>
-            </w:r>
-          </w:p>
-        </w:tc>
-        <w:tc>
-          <w:tcPr>
-            <w:tcW w:type="dxa" w:w="3360"/>
-            <w:tcMar>
-              <w:top w:w="80" w:type="dxa"/>
-              <w:start w:w="120" w:type="dxa"/>
-              <w:bottom w:w="80" w:type="dxa"/>
-              <w:end w:w="120" w:type="dxa"/>
-            </w:tcMar>
-            <w:vAlign w:val="center"/>
-          </w:tcPr>
-          <w:p>
-            <w:pPr>
-              <w:spacing w:before="0" w:after="40" w:line="252" w:lineRule="auto"/>
-            </w:pPr>
-            <w:r>
-              <w:rPr>
-                <w:rFonts w:ascii="Calibri" w:hAnsi="Calibri"/>
-                <w:color w:val="000000"/>
-                <w:sz w:val="18"/>
-              </w:rPr>
-              <w:t>None</w:t>
+        <w:tc>
+          <w:tcPr>
+            <w:tcW w:type="dxa" w:w="1700"/>
+            <w:vAlign w:val="center"/>
+            <w:tcMar>
+              <w:top w:w="90" w:type="dxa"/>
+              <w:start w:w="120" w:type="dxa"/>
+              <w:bottom w:w="90" w:type="dxa"/>
+              <w:end w:w="120" w:type="dxa"/>
+            </w:tcMar>
+          </w:tcPr>
+          <w:p>
+            <w:pPr>
+              <w:spacing w:after="0"/>
+            </w:pPr>
+            <w:r>
+              <w:t>Mission identity</w:t>
+            </w:r>
+          </w:p>
+        </w:tc>
+        <w:tc>
+          <w:tcPr>
+            <w:tcW w:type="dxa" w:w="4050"/>
+            <w:vAlign w:val="center"/>
+            <w:tcMar>
+              <w:top w:w="90" w:type="dxa"/>
+              <w:start w:w="120" w:type="dxa"/>
+              <w:bottom w:w="90" w:type="dxa"/>
+              <w:end w:w="120" w:type="dxa"/>
+            </w:tcMar>
+          </w:tcPr>
+          <w:p>
+            <w:pPr>
+              <w:spacing w:after="0"/>
+            </w:pPr>
+            <w:r>
+              <w:t>Name, mission ID, revision, completion action, and description.</w:t>
+            </w:r>
+          </w:p>
+        </w:tc>
+        <w:tc>
+          <w:tcPr>
+            <w:tcW w:type="dxa" w:w="3610"/>
+            <w:vAlign w:val="center"/>
+            <w:tcMar>
+              <w:top w:w="90" w:type="dxa"/>
+              <w:start w:w="120" w:type="dxa"/>
+              <w:bottom w:w="90" w:type="dxa"/>
+              <w:end w:w="120" w:type="dxa"/>
+            </w:tcMar>
+          </w:tcPr>
+          <w:p>
+            <w:pPr>
+              <w:spacing w:after="0"/>
+            </w:pPr>
+            <w:r>
+              <w:t>Defines the draft profile and its operator-visible identity.</w:t>
             </w:r>
           </w:p>
         </w:tc>
       </w:tr>
       <w:tr>
-        <w:trPr>
-          <w:cantSplit/>
-        </w:trPr>
-        <w:tc>
-          <w:tcPr>
-            <w:tcW w:type="dxa" w:w="1500"/>
-            <w:tcMar>
-              <w:top w:w="80" w:type="dxa"/>
-              <w:start w:w="120" w:type="dxa"/>
-              <w:bottom w:w="80" w:type="dxa"/>
-              <w:end w:w="120" w:type="dxa"/>
-            </w:tcMar>
-            <w:vAlign w:val="center"/>
-          </w:tcPr>
-          <w:p>
-            <w:pPr>
-              <w:spacing w:before="0" w:after="40" w:line="252" w:lineRule="auto"/>
-            </w:pPr>
-            <w:r>
-              <w:rPr>
-                <w:rFonts w:ascii="Calibri" w:hAnsi="Calibri"/>
-                <w:color w:val="000000"/>
-                <w:sz w:val="18"/>
-              </w:rPr>
-              <w:t>Warning</w:t>
-            </w:r>
-          </w:p>
-        </w:tc>
-        <w:tc>
-          <w:tcPr>
-            <w:tcW w:type="dxa" w:w="4500"/>
-            <w:tcMar>
-              <w:top w:w="80" w:type="dxa"/>
-              <w:start w:w="120" w:type="dxa"/>
-              <w:bottom w:w="80" w:type="dxa"/>
-              <w:end w:w="120" w:type="dxa"/>
-            </w:tcMar>
-            <w:vAlign w:val="center"/>
-          </w:tcPr>
-          <w:p>
-            <w:pPr>
-              <w:spacing w:before="0" w:after="40" w:line="252" w:lineRule="auto"/>
-            </w:pPr>
-            <w:r>
-              <w:rPr>
-                <w:rFonts w:ascii="Calibri" w:hAnsi="Calibri"/>
-                <w:color w:val="000000"/>
-                <w:sz w:val="18"/>
-              </w:rPr>
-              <w:t>Amber message with affected task/field</w:t>
-            </w:r>
-          </w:p>
-        </w:tc>
-        <w:tc>
-          <w:tcPr>
-            <w:tcW w:type="dxa" w:w="3360"/>
-            <w:tcMar>
-              <w:top w:w="80" w:type="dxa"/>
-              <w:start w:w="120" w:type="dxa"/>
-              <w:bottom w:w="80" w:type="dxa"/>
-              <w:end w:w="120" w:type="dxa"/>
-            </w:tcMar>
-            <w:vAlign w:val="center"/>
-          </w:tcPr>
-          <w:p>
-            <w:pPr>
-              <w:spacing w:before="0" w:after="40" w:line="252" w:lineRule="auto"/>
-            </w:pPr>
-            <w:r>
-              <w:rPr>
-                <w:rFonts w:ascii="Calibri" w:hAnsi="Calibri"/>
-                <w:color w:val="000000"/>
-                <w:sz w:val="18"/>
-              </w:rPr>
-              <w:t>Mission may load only if warning acknowledgement policy permits</w:t>
+        <w:tc>
+          <w:tcPr>
+            <w:tcW w:type="dxa" w:w="1700"/>
+            <w:vAlign w:val="center"/>
+            <w:tcMar>
+              <w:top w:w="90" w:type="dxa"/>
+              <w:start w:w="120" w:type="dxa"/>
+              <w:bottom w:w="90" w:type="dxa"/>
+              <w:end w:w="120" w:type="dxa"/>
+            </w:tcMar>
+          </w:tcPr>
+          <w:p>
+            <w:pPr>
+              <w:spacing w:after="0"/>
+            </w:pPr>
+            <w:r>
+              <w:t>Ordered task list</w:t>
+            </w:r>
+          </w:p>
+        </w:tc>
+        <w:tc>
+          <w:tcPr>
+            <w:tcW w:type="dxa" w:w="4050"/>
+            <w:vAlign w:val="center"/>
+            <w:tcMar>
+              <w:top w:w="90" w:type="dxa"/>
+              <w:start w:w="120" w:type="dxa"/>
+              <w:bottom w:w="90" w:type="dxa"/>
+              <w:end w:w="120" w:type="dxa"/>
+            </w:tcMar>
+          </w:tcPr>
+          <w:p>
+            <w:pPr>
+              <w:spacing w:after="0"/>
+            </w:pPr>
+            <w:r>
+              <w:t>Order, enabled state, task type, duration, summary, and validation state.</w:t>
+            </w:r>
+          </w:p>
+        </w:tc>
+        <w:tc>
+          <w:tcPr>
+            <w:tcW w:type="dxa" w:w="3610"/>
+            <w:vAlign w:val="center"/>
+            <w:tcMar>
+              <w:top w:w="90" w:type="dxa"/>
+              <w:start w:w="120" w:type="dxa"/>
+              <w:bottom w:w="90" w:type="dxa"/>
+              <w:end w:w="120" w:type="dxa"/>
+            </w:tcMar>
+          </w:tcPr>
+          <w:p>
+            <w:pPr>
+              <w:spacing w:after="0"/>
+            </w:pPr>
+            <w:r>
+              <w:t>Defines the primary 360 Scan and Sector Scan sequence.</w:t>
             </w:r>
           </w:p>
         </w:tc>
       </w:tr>
       <w:tr>
-        <w:trPr>
-          <w:cantSplit/>
-        </w:trPr>
-        <w:tc>
-          <w:tcPr>
-            <w:tcW w:type="dxa" w:w="1500"/>
-            <w:tcMar>
-              <w:top w:w="80" w:type="dxa"/>
-              <w:start w:w="120" w:type="dxa"/>
-              <w:bottom w:w="80" w:type="dxa"/>
-              <w:end w:w="120" w:type="dxa"/>
-            </w:tcMar>
-            <w:vAlign w:val="center"/>
-          </w:tcPr>
-          <w:p>
-            <w:pPr>
-              <w:spacing w:before="0" w:after="40" w:line="252" w:lineRule="auto"/>
-            </w:pPr>
-            <w:r>
-              <w:rPr>
-                <w:rFonts w:ascii="Calibri" w:hAnsi="Calibri"/>
-                <w:color w:val="000000"/>
-                <w:sz w:val="18"/>
-              </w:rPr>
-              <w:t>Error</w:t>
-            </w:r>
-          </w:p>
-        </w:tc>
-        <w:tc>
-          <w:tcPr>
-            <w:tcW w:type="dxa" w:w="4500"/>
-            <w:tcMar>
-              <w:top w:w="80" w:type="dxa"/>
-              <w:start w:w="120" w:type="dxa"/>
-              <w:bottom w:w="80" w:type="dxa"/>
-              <w:end w:w="120" w:type="dxa"/>
-            </w:tcMar>
-            <w:vAlign w:val="center"/>
-          </w:tcPr>
-          <w:p>
-            <w:pPr>
-              <w:spacing w:before="0" w:after="40" w:line="252" w:lineRule="auto"/>
-            </w:pPr>
-            <w:r>
-              <w:rPr>
-                <w:rFonts w:ascii="Calibri" w:hAnsi="Calibri"/>
-                <w:color w:val="000000"/>
-                <w:sz w:val="18"/>
-              </w:rPr>
-              <w:t>Red message and direct link/focus to the invalid field</w:t>
-            </w:r>
-          </w:p>
-        </w:tc>
-        <w:tc>
-          <w:tcPr>
-            <w:tcW w:type="dxa" w:w="3360"/>
-            <w:tcMar>
-              <w:top w:w="80" w:type="dxa"/>
-              <w:start w:w="120" w:type="dxa"/>
-              <w:bottom w:w="80" w:type="dxa"/>
-              <w:end w:w="120" w:type="dxa"/>
-            </w:tcMar>
-            <w:vAlign w:val="center"/>
-          </w:tcPr>
-          <w:p>
-            <w:pPr>
-              <w:spacing w:before="0" w:after="40" w:line="252" w:lineRule="auto"/>
-            </w:pPr>
-            <w:r>
-              <w:rPr>
-                <w:rFonts w:ascii="Calibri" w:hAnsi="Calibri"/>
-                <w:color w:val="000000"/>
-                <w:sz w:val="18"/>
-              </w:rPr>
-              <w:t>Validate and Load Mission disabled</w:t>
+        <w:tc>
+          <w:tcPr>
+            <w:tcW w:type="dxa" w:w="1700"/>
+            <w:vAlign w:val="center"/>
+            <w:tcMar>
+              <w:top w:w="90" w:type="dxa"/>
+              <w:start w:w="120" w:type="dxa"/>
+              <w:bottom w:w="90" w:type="dxa"/>
+              <w:end w:w="120" w:type="dxa"/>
+            </w:tcMar>
+          </w:tcPr>
+          <w:p>
+            <w:pPr>
+              <w:spacing w:after="0"/>
+            </w:pPr>
+            <w:r>
+              <w:t>Selected-task editor</w:t>
+            </w:r>
+          </w:p>
+        </w:tc>
+        <w:tc>
+          <w:tcPr>
+            <w:tcW w:type="dxa" w:w="4050"/>
+            <w:vAlign w:val="center"/>
+            <w:tcMar>
+              <w:top w:w="90" w:type="dxa"/>
+              <w:start w:w="120" w:type="dxa"/>
+              <w:bottom w:w="90" w:type="dxa"/>
+              <w:end w:w="120" w:type="dxa"/>
+            </w:tcMar>
+          </w:tcPr>
+          <w:p>
+            <w:pPr>
+              <w:spacing w:after="0"/>
+            </w:pPr>
+            <w:r>
+              <w:t>Common radar fields plus task-specific motion controls.</w:t>
+            </w:r>
+          </w:p>
+        </w:tc>
+        <w:tc>
+          <w:tcPr>
+            <w:tcW w:type="dxa" w:w="3610"/>
+            <w:vAlign w:val="center"/>
+            <w:tcMar>
+              <w:top w:w="90" w:type="dxa"/>
+              <w:start w:w="120" w:type="dxa"/>
+              <w:bottom w:w="90" w:type="dxa"/>
+              <w:end w:w="120" w:type="dxa"/>
+            </w:tcMar>
+          </w:tcPr>
+          <w:p>
+            <w:pPr>
+              <w:spacing w:after="0"/>
+            </w:pPr>
+            <w:r>
+              <w:t>Edits only the selected draft task.</w:t>
             </w:r>
           </w:p>
         </w:tc>
       </w:tr>
       <w:tr>
-        <w:trPr>
-          <w:cantSplit/>
-        </w:trPr>
-        <w:tc>
-          <w:tcPr>
-            <w:tcW w:type="dxa" w:w="1500"/>
-            <w:tcMar>
-              <w:top w:w="80" w:type="dxa"/>
-              <w:start w:w="120" w:type="dxa"/>
-              <w:bottom w:w="80" w:type="dxa"/>
-              <w:end w:w="120" w:type="dxa"/>
-            </w:tcMar>
-            <w:vAlign w:val="center"/>
-          </w:tcPr>
-          <w:p>
-            <w:pPr>
-              <w:spacing w:before="0" w:after="40" w:line="252" w:lineRule="auto"/>
-            </w:pPr>
-            <w:r>
-              <w:rPr>
-                <w:rFonts w:ascii="Calibri" w:hAnsi="Calibri"/>
-                <w:color w:val="000000"/>
-                <w:sz w:val="18"/>
-              </w:rPr>
-              <w:t>Live fault</w:t>
-            </w:r>
-          </w:p>
-        </w:tc>
-        <w:tc>
-          <w:tcPr>
-            <w:tcW w:type="dxa" w:w="4500"/>
-            <w:tcMar>
-              <w:top w:w="80" w:type="dxa"/>
-              <w:start w:w="120" w:type="dxa"/>
-              <w:bottom w:w="80" w:type="dxa"/>
-              <w:end w:w="120" w:type="dxa"/>
-            </w:tcMar>
-            <w:vAlign w:val="center"/>
-          </w:tcPr>
-          <w:p>
-            <w:pPr>
-              <w:spacing w:before="0" w:after="40" w:line="252" w:lineRule="auto"/>
-            </w:pPr>
-            <w:r>
-              <w:rPr>
-                <w:rFonts w:ascii="Calibri" w:hAnsi="Calibri"/>
-                <w:color w:val="000000"/>
-                <w:sz w:val="18"/>
-              </w:rPr>
-              <w:t>Persistent red banner and fault code</w:t>
-            </w:r>
-          </w:p>
-        </w:tc>
-        <w:tc>
-          <w:tcPr>
-            <w:tcW w:type="dxa" w:w="3360"/>
-            <w:tcMar>
-              <w:top w:w="80" w:type="dxa"/>
-              <w:start w:w="120" w:type="dxa"/>
-              <w:bottom w:w="80" w:type="dxa"/>
-              <w:end w:w="120" w:type="dxa"/>
-            </w:tcMar>
-            <w:vAlign w:val="center"/>
-          </w:tcPr>
-          <w:p>
-            <w:pPr>
-              <w:spacing w:before="0" w:after="40" w:line="252" w:lineRule="auto"/>
-            </w:pPr>
-            <w:r>
-              <w:rPr>
-                <w:rFonts w:ascii="Calibri" w:hAnsi="Calibri"/>
-                <w:color w:val="000000"/>
-                <w:sz w:val="18"/>
-              </w:rPr>
-              <w:t>Start inhibited or running mission safely stopped</w:t>
+        <w:tc>
+          <w:tcPr>
+            <w:tcW w:type="dxa" w:w="1700"/>
+            <w:vAlign w:val="center"/>
+            <w:tcMar>
+              <w:top w:w="90" w:type="dxa"/>
+              <w:start w:w="120" w:type="dxa"/>
+              <w:bottom w:w="90" w:type="dxa"/>
+              <w:end w:w="120" w:type="dxa"/>
+            </w:tcMar>
+          </w:tcPr>
+          <w:p>
+            <w:pPr>
+              <w:spacing w:after="0"/>
+            </w:pPr>
+            <w:r>
+              <w:t>Validation results</w:t>
+            </w:r>
+          </w:p>
+        </w:tc>
+        <w:tc>
+          <w:tcPr>
+            <w:tcW w:type="dxa" w:w="4050"/>
+            <w:vAlign w:val="center"/>
+            <w:tcMar>
+              <w:top w:w="90" w:type="dxa"/>
+              <w:start w:w="120" w:type="dxa"/>
+              <w:bottom w:w="90" w:type="dxa"/>
+              <w:end w:w="120" w:type="dxa"/>
+            </w:tcMar>
+          </w:tcPr>
+          <w:p>
+            <w:pPr>
+              <w:spacing w:after="0"/>
+            </w:pPr>
+            <w:r>
+              <w:t>Severity, field, and explanatory message.</w:t>
+            </w:r>
+          </w:p>
+        </w:tc>
+        <w:tc>
+          <w:tcPr>
+            <w:tcW w:type="dxa" w:w="3610"/>
+            <w:vAlign w:val="center"/>
+            <w:tcMar>
+              <w:top w:w="90" w:type="dxa"/>
+              <w:start w:w="120" w:type="dxa"/>
+              <w:bottom w:w="90" w:type="dxa"/>
+              <w:end w:w="120" w:type="dxa"/>
+            </w:tcMar>
+          </w:tcPr>
+          <w:p>
+            <w:pPr>
+              <w:spacing w:after="0"/>
+            </w:pPr>
+            <w:r>
+              <w:t>Explains whether the draft may be loaded and why.</w:t>
+            </w:r>
+          </w:p>
+        </w:tc>
+      </w:tr>
+      <w:tr>
+        <w:tc>
+          <w:tcPr>
+            <w:tcW w:type="dxa" w:w="1700"/>
+            <w:vAlign w:val="center"/>
+            <w:tcMar>
+              <w:top w:w="90" w:type="dxa"/>
+              <w:start w:w="120" w:type="dxa"/>
+              <w:bottom w:w="90" w:type="dxa"/>
+              <w:end w:w="120" w:type="dxa"/>
+            </w:tcMar>
+          </w:tcPr>
+          <w:p>
+            <w:pPr>
+              <w:spacing w:after="0"/>
+            </w:pPr>
+            <w:r>
+              <w:t>Command bar</w:t>
+            </w:r>
+          </w:p>
+        </w:tc>
+        <w:tc>
+          <w:tcPr>
+            <w:tcW w:type="dxa" w:w="4050"/>
+            <w:vAlign w:val="center"/>
+            <w:tcMar>
+              <w:top w:w="90" w:type="dxa"/>
+              <w:start w:w="120" w:type="dxa"/>
+              <w:bottom w:w="90" w:type="dxa"/>
+              <w:end w:w="120" w:type="dxa"/>
+            </w:tcMar>
+          </w:tcPr>
+          <w:p>
+            <w:pPr>
+              <w:spacing w:after="0"/>
+            </w:pPr>
+            <w:r>
+              <w:t>File, validation, load, start, and pause controls.</w:t>
+            </w:r>
+          </w:p>
+        </w:tc>
+        <w:tc>
+          <w:tcPr>
+            <w:tcW w:type="dxa" w:w="3610"/>
+            <w:vAlign w:val="center"/>
+            <w:tcMar>
+              <w:top w:w="90" w:type="dxa"/>
+              <w:start w:w="120" w:type="dxa"/>
+              <w:bottom w:w="90" w:type="dxa"/>
+              <w:end w:w="120" w:type="dxa"/>
+            </w:tcMar>
+          </w:tcPr>
+          <w:p>
+            <w:pPr>
+              <w:spacing w:after="0"/>
+            </w:pPr>
+            <w:r>
+              <w:t>Applies the explicit draft-to-execution workflow.</w:t>
             </w:r>
           </w:p>
         </w:tc>
@@ -10540,84 +9690,141 @@
     </w:tbl>
     <w:p>
       <w:pPr>
-        <w:spacing w:after="0"/>
+        <w:keepNext/>
+        <w:pageBreakBefore w:val="0"/>
+        <w:jc w:val="center"/>
       </w:pPr>
+      <w:r>
+        <w:drawing>
+          <wp:inline xmlns:a="http://schemas.openxmlformats.org/drawingml/2006/main" xmlns:pic="http://schemas.openxmlformats.org/drawingml/2006/picture">
+            <wp:extent cx="5897880" cy="3938478"/>
+            <wp:docPr id="2" name="Picture 2" title="Vanguard X interface figure 2" descr="Screenshot of the Vanguard X Mission tab. The top contains mission identity fields. The left contains an ordered primary-task list and task editing buttons. The right contains the selected 360 Scan task editor. The lower area contains validation results and command buttons for creating, saving, validating, loading, starting and pausing a mission."/>
+            <wp:cNvGraphicFramePr>
+              <a:graphicFrameLocks noChangeAspect="1"/>
+            </wp:cNvGraphicFramePr>
+            <a:graphic>
+              <a:graphicData uri="http://schemas.openxmlformats.org/drawingml/2006/picture">
+                <pic:pic>
+                  <pic:nvPicPr>
+                    <pic:cNvPr id="0" name="Screenshot from 2026-07-24 14-20-37(1).png"/>
+                    <pic:cNvPicPr/>
+                  </pic:nvPicPr>
+                  <pic:blipFill>
+                    <a:blip r:embed="rId12"/>
+                    <a:stretch>
+                      <a:fillRect/>
+                    </a:stretch>
+                  </pic:blipFill>
+                  <pic:spPr>
+                    <a:xfrm>
+                      <a:off x="0" y="0"/>
+                      <a:ext cx="5897880" cy="3938478"/>
+                    </a:xfrm>
+                    <a:prstGeom prst="rect"/>
+                  </pic:spPr>
+                </pic:pic>
+              </a:graphicData>
+            </a:graphic>
+          </wp:inline>
+        </w:drawing>
+      </w:r>
+    </w:p>
+    <w:p>
+      <w:pPr>
+        <w:pStyle w:val="Caption"/>
+        <w:keepNext w:val="0"/>
+        <w:jc w:val="center"/>
+      </w:pPr>
+      <w:r>
+        <w:t xml:space="preserve">Figure </w:t>
+      </w:r>
+      <w:bookmarkStart w:id="102" w:name="fig_mission_tab"/>
+      <w:fldChar w:fldCharType="begin"/>
+      <w:instrText xml:space="preserve"> SEQ Figure </w:instrText>
+      <w:fldChar w:fldCharType="separate"/>
+      <w:r>
+        <w:t>2</w:t>
+      </w:r>
+      <w:fldChar w:fldCharType="end"/>
+      <w:bookmarkEnd w:id="102"/>
+      <w:r>
+        <w:t>. Vanguard X Mission tab showing mission identity, ordered tasks, the selected 360 Scan editor, validation messages, and mission lifecycle controls.</w:t>
+      </w:r>
     </w:p>
     <w:p>
       <w:pPr>
         <w:pStyle w:val="Heading2"/>
+        <w:keepNext/>
       </w:pPr>
       <w:r>
-        <w:t>8.5 Controls and operator workflow</w:t>
+        <w:t>8.3 Mission identity and draft ownership</w:t>
+      </w:r>
+    </w:p>
+    <w:p>
+      <w:pPr/>
+      <w:r>
+        <w:t>The Mission identity strip applies to the complete draft profile. Name is the operator-facing label; Mission ID is the stable internal identifier; Revision identifies the profile revision; Completion defines the action after the enabled primary-task sequence ends; and Description records purpose, assumptions, limitations, or approval status.</w:t>
       </w:r>
     </w:p>
     <w:tbl>
       <w:tblPr>
         <w:tblStyle w:val="TableGrid"/>
         <w:tblW w:type="dxa" w:w="9360"/>
-        <w:jc w:val="left"/>
         <w:tblLayout w:type="fixed"/>
         <w:tblLook w:firstColumn="1" w:firstRow="1" w:lastColumn="0" w:lastRow="0" w:noHBand="0" w:noVBand="1" w:val="04A0"/>
-        <w:tblInd w:w="120" w:type="dxa"/>
+        <w:tblInd w:w="0" w:type="dxa"/>
       </w:tblPr>
       <w:tblGrid>
-        <w:gridCol w:w="2500"/>
-        <w:gridCol w:w="6860"/>
+        <w:gridCol w:w="1900"/>
+        <w:gridCol w:w="7460"/>
       </w:tblGrid>
       <w:tr>
         <w:trPr>
-          <w:cantSplit/>
           <w:tblHeader w:val="true"/>
         </w:trPr>
         <w:tc>
           <w:tcPr>
-            <w:tcW w:type="dxa" w:w="2500"/>
-            <w:tcMar>
-              <w:top w:w="80" w:type="dxa"/>
-              <w:start w:w="120" w:type="dxa"/>
-              <w:bottom w:w="80" w:type="dxa"/>
-              <w:end w:w="120" w:type="dxa"/>
-            </w:tcMar>
-            <w:vAlign w:val="center"/>
-            <w:shd w:fill="E8EEF5"/>
-          </w:tcPr>
-          <w:p>
-            <w:pPr>
-              <w:spacing w:before="0" w:after="40" w:line="252" w:lineRule="auto"/>
-            </w:pPr>
-            <w:r>
-              <w:rPr>
-                <w:rFonts w:ascii="Calibri" w:hAnsi="Calibri"/>
+            <w:tcW w:type="dxa" w:w="1900"/>
+            <w:vAlign w:val="center"/>
+            <w:tcMar>
+              <w:top w:w="90" w:type="dxa"/>
+              <w:start w:w="120" w:type="dxa"/>
+              <w:bottom w:w="90" w:type="dxa"/>
+              <w:end w:w="120" w:type="dxa"/>
+            </w:tcMar>
+            <w:shd w:fill="D9E2F3"/>
+          </w:tcPr>
+          <w:p>
+            <w:pPr>
+              <w:spacing w:after="0"/>
+            </w:pPr>
+            <w:r>
+              <w:rPr>
                 <w:b/>
-                <w:color w:val="0B2545"/>
-                <w:sz w:val="18"/>
-              </w:rPr>
-              <w:t>Control</w:t>
-            </w:r>
-          </w:p>
-        </w:tc>
-        <w:tc>
-          <w:tcPr>
-            <w:tcW w:type="dxa" w:w="6860"/>
-            <w:tcMar>
-              <w:top w:w="80" w:type="dxa"/>
-              <w:start w:w="120" w:type="dxa"/>
-              <w:bottom w:w="80" w:type="dxa"/>
-              <w:end w:w="120" w:type="dxa"/>
-            </w:tcMar>
-            <w:vAlign w:val="center"/>
-            <w:shd w:fill="E8EEF5"/>
-          </w:tcPr>
-          <w:p>
-            <w:pPr>
-              <w:spacing w:before="0" w:after="40" w:line="252" w:lineRule="auto"/>
-            </w:pPr>
-            <w:r>
-              <w:rPr>
-                <w:rFonts w:ascii="Calibri" w:hAnsi="Calibri"/>
+              </w:rPr>
+              <w:t>Field</w:t>
+            </w:r>
+          </w:p>
+        </w:tc>
+        <w:tc>
+          <w:tcPr>
+            <w:tcW w:type="dxa" w:w="7460"/>
+            <w:vAlign w:val="center"/>
+            <w:tcMar>
+              <w:top w:w="90" w:type="dxa"/>
+              <w:start w:w="120" w:type="dxa"/>
+              <w:bottom w:w="90" w:type="dxa"/>
+              <w:end w:w="120" w:type="dxa"/>
+            </w:tcMar>
+            <w:shd w:fill="D9E2F3"/>
+          </w:tcPr>
+          <w:p>
+            <w:pPr>
+              <w:spacing w:after="0"/>
+            </w:pPr>
+            <w:r>
+              <w:rPr>
                 <w:b/>
-                <w:color w:val="0B2545"/>
-                <w:sz w:val="18"/>
               </w:rPr>
               <w:t>Behaviour</w:t>
             </w:r>
@@ -10625,395 +9832,1675 @@
         </w:tc>
       </w:tr>
       <w:tr>
-        <w:trPr>
-          <w:cantSplit/>
-        </w:trPr>
-        <w:tc>
-          <w:tcPr>
-            <w:tcW w:type="dxa" w:w="2500"/>
-            <w:tcMar>
-              <w:top w:w="80" w:type="dxa"/>
-              <w:start w:w="120" w:type="dxa"/>
-              <w:bottom w:w="80" w:type="dxa"/>
-              <w:end w:w="120" w:type="dxa"/>
-            </w:tcMar>
-            <w:vAlign w:val="center"/>
-          </w:tcPr>
-          <w:p>
-            <w:pPr>
-              <w:spacing w:before="0" w:after="40" w:line="252" w:lineRule="auto"/>
-            </w:pPr>
-            <w:r>
-              <w:rPr>
-                <w:rFonts w:ascii="Calibri" w:hAnsi="Calibri"/>
-                <w:color w:val="000000"/>
-                <w:sz w:val="18"/>
-              </w:rPr>
-              <w:t>New / Load file / Save file</w:t>
-            </w:r>
-          </w:p>
-        </w:tc>
-        <w:tc>
-          <w:tcPr>
-            <w:tcW w:type="dxa" w:w="6860"/>
-            <w:tcMar>
-              <w:top w:w="80" w:type="dxa"/>
-              <w:start w:w="120" w:type="dxa"/>
-              <w:bottom w:w="80" w:type="dxa"/>
-              <w:end w:w="120" w:type="dxa"/>
-            </w:tcMar>
-            <w:vAlign w:val="center"/>
-          </w:tcPr>
-          <w:p>
-            <w:pPr>
-              <w:spacing w:before="0" w:after="40" w:line="252" w:lineRule="auto"/>
-            </w:pPr>
-            <w:r>
-              <w:rPr>
-                <w:rFonts w:ascii="Calibri" w:hAnsi="Calibri"/>
-                <w:color w:val="000000"/>
-                <w:sz w:val="18"/>
-              </w:rPr>
-              <w:t>Manage draft mission profiles and schema version.</w:t>
+        <w:tc>
+          <w:tcPr>
+            <w:tcW w:type="dxa" w:w="1900"/>
+            <w:vAlign w:val="center"/>
+            <w:tcMar>
+              <w:top w:w="90" w:type="dxa"/>
+              <w:start w:w="120" w:type="dxa"/>
+              <w:bottom w:w="90" w:type="dxa"/>
+              <w:end w:w="120" w:type="dxa"/>
+            </w:tcMar>
+          </w:tcPr>
+          <w:p>
+            <w:pPr>
+              <w:spacing w:after="0"/>
+            </w:pPr>
+            <w:r>
+              <w:t>Name</w:t>
+            </w:r>
+          </w:p>
+        </w:tc>
+        <w:tc>
+          <w:tcPr>
+            <w:tcW w:type="dxa" w:w="7460"/>
+            <w:vAlign w:val="center"/>
+            <w:tcMar>
+              <w:top w:w="90" w:type="dxa"/>
+              <w:start w:w="120" w:type="dxa"/>
+              <w:bottom w:w="90" w:type="dxa"/>
+              <w:end w:w="120" w:type="dxa"/>
+            </w:tcMar>
+          </w:tcPr>
+          <w:p>
+            <w:pPr>
+              <w:spacing w:after="0"/>
+            </w:pPr>
+            <w:r>
+              <w:t>Editable human-readable mission name.</w:t>
             </w:r>
           </w:p>
         </w:tc>
       </w:tr>
       <w:tr>
-        <w:trPr>
-          <w:cantSplit/>
-        </w:trPr>
-        <w:tc>
-          <w:tcPr>
-            <w:tcW w:type="dxa" w:w="2500"/>
-            <w:tcMar>
-              <w:top w:w="80" w:type="dxa"/>
-              <w:start w:w="120" w:type="dxa"/>
-              <w:bottom w:w="80" w:type="dxa"/>
-              <w:end w:w="120" w:type="dxa"/>
-            </w:tcMar>
-            <w:vAlign w:val="center"/>
-          </w:tcPr>
-          <w:p>
-            <w:pPr>
-              <w:spacing w:before="0" w:after="40" w:line="252" w:lineRule="auto"/>
-            </w:pPr>
-            <w:r>
-              <w:rPr>
-                <w:rFonts w:ascii="Calibri" w:hAnsi="Calibri"/>
-                <w:color w:val="000000"/>
-                <w:sz w:val="18"/>
-              </w:rPr>
-              <w:t>Validate Mission</w:t>
-            </w:r>
-          </w:p>
-        </w:tc>
-        <w:tc>
-          <w:tcPr>
-            <w:tcW w:type="dxa" w:w="6860"/>
-            <w:tcMar>
-              <w:top w:w="80" w:type="dxa"/>
-              <w:start w:w="120" w:type="dxa"/>
-              <w:bottom w:w="80" w:type="dxa"/>
-              <w:end w:w="120" w:type="dxa"/>
-            </w:tcMar>
-            <w:vAlign w:val="center"/>
-          </w:tcPr>
-          <w:p>
-            <w:pPr>
-              <w:spacing w:before="0" w:after="40" w:line="252" w:lineRule="auto"/>
-            </w:pPr>
-            <w:r>
-              <w:rPr>
-                <w:rFonts w:ascii="Calibri" w:hAnsi="Calibri"/>
-                <w:color w:val="000000"/>
-                <w:sz w:val="18"/>
-              </w:rPr>
-              <w:t>Run static checks against configuration and display all warnings/errors.</w:t>
+        <w:tc>
+          <w:tcPr>
+            <w:tcW w:type="dxa" w:w="1900"/>
+            <w:vAlign w:val="center"/>
+            <w:tcMar>
+              <w:top w:w="90" w:type="dxa"/>
+              <w:start w:w="120" w:type="dxa"/>
+              <w:bottom w:w="90" w:type="dxa"/>
+              <w:end w:w="120" w:type="dxa"/>
+            </w:tcMar>
+          </w:tcPr>
+          <w:p>
+            <w:pPr>
+              <w:spacing w:after="0"/>
+            </w:pPr>
+            <w:r>
+              <w:t>Mission ID</w:t>
+            </w:r>
+          </w:p>
+        </w:tc>
+        <w:tc>
+          <w:tcPr>
+            <w:tcW w:type="dxa" w:w="7460"/>
+            <w:vAlign w:val="center"/>
+            <w:tcMar>
+              <w:top w:w="90" w:type="dxa"/>
+              <w:start w:w="120" w:type="dxa"/>
+              <w:bottom w:w="90" w:type="dxa"/>
+              <w:end w:w="120" w:type="dxa"/>
+            </w:tcMar>
+          </w:tcPr>
+          <w:p>
+            <w:pPr>
+              <w:spacing w:after="0"/>
+            </w:pPr>
+            <w:r>
+              <w:t>Stable unique identifier used in snapshots, logs, and replay.</w:t>
             </w:r>
           </w:p>
         </w:tc>
       </w:tr>
       <w:tr>
-        <w:trPr>
-          <w:cantSplit/>
-        </w:trPr>
-        <w:tc>
-          <w:tcPr>
-            <w:tcW w:type="dxa" w:w="2500"/>
-            <w:tcMar>
-              <w:top w:w="80" w:type="dxa"/>
-              <w:start w:w="120" w:type="dxa"/>
-              <w:bottom w:w="80" w:type="dxa"/>
-              <w:end w:w="120" w:type="dxa"/>
-            </w:tcMar>
-            <w:vAlign w:val="center"/>
-          </w:tcPr>
-          <w:p>
-            <w:pPr>
-              <w:spacing w:before="0" w:after="40" w:line="252" w:lineRule="auto"/>
-            </w:pPr>
-            <w:r>
-              <w:rPr>
-                <w:rFonts w:ascii="Calibri" w:hAnsi="Calibri"/>
-                <w:color w:val="000000"/>
-                <w:sz w:val="18"/>
-              </w:rPr>
-              <w:t>Load Mission</w:t>
-            </w:r>
-          </w:p>
-        </w:tc>
-        <w:tc>
-          <w:tcPr>
-            <w:tcW w:type="dxa" w:w="6860"/>
-            <w:tcMar>
-              <w:top w:w="80" w:type="dxa"/>
-              <w:start w:w="120" w:type="dxa"/>
-              <w:bottom w:w="80" w:type="dxa"/>
-              <w:end w:w="120" w:type="dxa"/>
-            </w:tcMar>
-            <w:vAlign w:val="center"/>
-          </w:tcPr>
-          <w:p>
-            <w:pPr>
-              <w:spacing w:before="0" w:after="40" w:line="252" w:lineRule="auto"/>
-            </w:pPr>
-            <w:r>
-              <w:rPr>
-                <w:rFonts w:ascii="Calibri" w:hAnsi="Calibri"/>
-                <w:color w:val="000000"/>
-                <w:sz w:val="18"/>
-              </w:rPr>
-              <w:t>Freeze the validated snapshot for execution; initially allowed only while STOPPED.</w:t>
+        <w:tc>
+          <w:tcPr>
+            <w:tcW w:type="dxa" w:w="1900"/>
+            <w:vAlign w:val="center"/>
+            <w:tcMar>
+              <w:top w:w="90" w:type="dxa"/>
+              <w:start w:w="120" w:type="dxa"/>
+              <w:bottom w:w="90" w:type="dxa"/>
+              <w:end w:w="120" w:type="dxa"/>
+            </w:tcMar>
+          </w:tcPr>
+          <w:p>
+            <w:pPr>
+              <w:spacing w:after="0"/>
+            </w:pPr>
+            <w:r>
+              <w:t>Revision</w:t>
+            </w:r>
+          </w:p>
+        </w:tc>
+        <w:tc>
+          <w:tcPr>
+            <w:tcW w:type="dxa" w:w="7460"/>
+            <w:vAlign w:val="center"/>
+            <w:tcMar>
+              <w:top w:w="90" w:type="dxa"/>
+              <w:start w:w="120" w:type="dxa"/>
+              <w:bottom w:w="90" w:type="dxa"/>
+              <w:end w:w="120" w:type="dxa"/>
+            </w:tcMar>
+          </w:tcPr>
+          <w:p>
+            <w:pPr>
+              <w:spacing w:after="0"/>
+            </w:pPr>
+            <w:r>
+              <w:t>Operator-visible profile revision; incremented under configuration control.</w:t>
             </w:r>
           </w:p>
         </w:tc>
       </w:tr>
       <w:tr>
-        <w:trPr>
-          <w:cantSplit/>
-        </w:trPr>
-        <w:tc>
-          <w:tcPr>
-            <w:tcW w:type="dxa" w:w="2500"/>
-            <w:tcMar>
-              <w:top w:w="80" w:type="dxa"/>
-              <w:start w:w="120" w:type="dxa"/>
-              <w:bottom w:w="80" w:type="dxa"/>
-              <w:end w:w="120" w:type="dxa"/>
-            </w:tcMar>
-            <w:vAlign w:val="center"/>
-          </w:tcPr>
-          <w:p>
-            <w:pPr>
-              <w:spacing w:before="0" w:after="40" w:line="252" w:lineRule="auto"/>
-            </w:pPr>
-            <w:r>
-              <w:rPr>
-                <w:rFonts w:ascii="Calibri" w:hAnsi="Calibri"/>
-                <w:color w:val="000000"/>
-                <w:sz w:val="18"/>
-              </w:rPr>
-              <w:t>Start Mission</w:t>
-            </w:r>
-          </w:p>
-        </w:tc>
-        <w:tc>
-          <w:tcPr>
-            <w:tcW w:type="dxa" w:w="6860"/>
-            <w:tcMar>
-              <w:top w:w="80" w:type="dxa"/>
-              <w:start w:w="120" w:type="dxa"/>
-              <w:bottom w:w="80" w:type="dxa"/>
-              <w:end w:w="120" w:type="dxa"/>
-            </w:tcMar>
-            <w:vAlign w:val="center"/>
-          </w:tcPr>
-          <w:p>
-            <w:pPr>
-              <w:spacing w:before="0" w:after="40" w:line="252" w:lineRule="auto"/>
-            </w:pPr>
-            <w:r>
-              <w:rPr>
-                <w:rFonts w:ascii="Calibri" w:hAnsi="Calibri"/>
-                <w:color w:val="000000"/>
-                <w:sz w:val="18"/>
-              </w:rPr>
-              <w:t>Start the loaded snapshot after live dependency and safety checks.</w:t>
+        <w:tc>
+          <w:tcPr>
+            <w:tcW w:type="dxa" w:w="1900"/>
+            <w:vAlign w:val="center"/>
+            <w:tcMar>
+              <w:top w:w="90" w:type="dxa"/>
+              <w:start w:w="120" w:type="dxa"/>
+              <w:bottom w:w="90" w:type="dxa"/>
+              <w:end w:w="120" w:type="dxa"/>
+            </w:tcMar>
+          </w:tcPr>
+          <w:p>
+            <w:pPr>
+              <w:spacing w:after="0"/>
+            </w:pPr>
+            <w:r>
+              <w:t>Completion</w:t>
+            </w:r>
+          </w:p>
+        </w:tc>
+        <w:tc>
+          <w:tcPr>
+            <w:tcW w:type="dxa" w:w="7460"/>
+            <w:vAlign w:val="center"/>
+            <w:tcMar>
+              <w:top w:w="90" w:type="dxa"/>
+              <w:start w:w="120" w:type="dxa"/>
+              <w:bottom w:w="90" w:type="dxa"/>
+              <w:end w:w="120" w:type="dxa"/>
+            </w:tcMar>
+          </w:tcPr>
+          <w:p>
+            <w:pPr>
+              <w:spacing w:after="0"/>
+            </w:pPr>
+            <w:r>
+              <w:t>Mission-level action after the enabled primary sequence completes, such as STOP or REPEAT.</w:t>
             </w:r>
           </w:p>
         </w:tc>
       </w:tr>
       <w:tr>
-        <w:trPr>
-          <w:cantSplit/>
-        </w:trPr>
-        <w:tc>
-          <w:tcPr>
-            <w:tcW w:type="dxa" w:w="2500"/>
-            <w:tcMar>
-              <w:top w:w="80" w:type="dxa"/>
-              <w:start w:w="120" w:type="dxa"/>
-              <w:bottom w:w="80" w:type="dxa"/>
-              <w:end w:w="120" w:type="dxa"/>
-            </w:tcMar>
-            <w:vAlign w:val="center"/>
-          </w:tcPr>
-          <w:p>
-            <w:pPr>
-              <w:spacing w:before="0" w:after="40" w:line="252" w:lineRule="auto"/>
-            </w:pPr>
-            <w:r>
-              <w:rPr>
-                <w:rFonts w:ascii="Calibri" w:hAnsi="Calibri"/>
-                <w:color w:val="000000"/>
-                <w:sz w:val="18"/>
-              </w:rPr>
-              <w:t>Pause</w:t>
-            </w:r>
-          </w:p>
-        </w:tc>
-        <w:tc>
-          <w:tcPr>
-            <w:tcW w:type="dxa" w:w="6860"/>
-            <w:tcMar>
-              <w:top w:w="80" w:type="dxa"/>
-              <w:start w:w="120" w:type="dxa"/>
-              <w:bottom w:w="80" w:type="dxa"/>
-              <w:end w:w="120" w:type="dxa"/>
-            </w:tcMar>
-            <w:vAlign w:val="center"/>
-          </w:tcPr>
-          <w:p>
-            <w:pPr>
-              <w:spacing w:before="0" w:after="40" w:line="252" w:lineRule="auto"/>
-            </w:pPr>
-            <w:r>
-              <w:rPr>
-                <w:rFonts w:ascii="Calibri" w:hAnsi="Calibri"/>
-                <w:color w:val="000000"/>
-                <w:sz w:val="18"/>
-              </w:rPr>
-              <w:t>Finish current CPI, inhibit RF, and apply the defined antenna pause policy.</w:t>
-            </w:r>
-          </w:p>
-        </w:tc>
-      </w:tr>
-      <w:tr>
-        <w:trPr>
-          <w:cantSplit/>
-        </w:trPr>
-        <w:tc>
-          <w:tcPr>
-            <w:tcW w:type="dxa" w:w="2500"/>
-            <w:tcMar>
-              <w:top w:w="80" w:type="dxa"/>
-              <w:start w:w="120" w:type="dxa"/>
-              <w:bottom w:w="80" w:type="dxa"/>
-              <w:end w:w="120" w:type="dxa"/>
-            </w:tcMar>
-            <w:vAlign w:val="center"/>
-          </w:tcPr>
-          <w:p>
-            <w:pPr>
-              <w:spacing w:before="0" w:after="40" w:line="252" w:lineRule="auto"/>
-            </w:pPr>
-            <w:r>
-              <w:rPr>
-                <w:rFonts w:ascii="Calibri" w:hAnsi="Calibri"/>
-                <w:color w:val="000000"/>
-                <w:sz w:val="18"/>
-              </w:rPr>
-              <w:t>STOP</w:t>
-            </w:r>
-          </w:p>
-        </w:tc>
-        <w:tc>
-          <w:tcPr>
-            <w:tcW w:type="dxa" w:w="6860"/>
-            <w:tcMar>
-              <w:top w:w="80" w:type="dxa"/>
-              <w:start w:w="120" w:type="dxa"/>
-              <w:bottom w:w="80" w:type="dxa"/>
-              <w:end w:w="120" w:type="dxa"/>
-            </w:tcMar>
-            <w:vAlign w:val="center"/>
-          </w:tcPr>
-          <w:p>
-            <w:pPr>
-              <w:spacing w:before="0" w:after="40" w:line="252" w:lineRule="auto"/>
-            </w:pPr>
-            <w:r>
-              <w:rPr>
-                <w:rFonts w:ascii="Calibri" w:hAnsi="Calibri"/>
-                <w:color w:val="000000"/>
-                <w:sz w:val="18"/>
-              </w:rPr>
-              <w:t>Prominent and always available; safely inhibits RF and stops/holds motion according to the emergency policy.</w:t>
-            </w:r>
-          </w:p>
-        </w:tc>
-      </w:tr>
-      <w:tr>
-        <w:trPr>
-          <w:cantSplit/>
-        </w:trPr>
-        <w:tc>
-          <w:tcPr>
-            <w:tcW w:type="dxa" w:w="2500"/>
-            <w:tcMar>
-              <w:top w:w="80" w:type="dxa"/>
-              <w:start w:w="120" w:type="dxa"/>
-              <w:bottom w:w="80" w:type="dxa"/>
-              <w:end w:w="120" w:type="dxa"/>
-            </w:tcMar>
-            <w:vAlign w:val="center"/>
-          </w:tcPr>
-          <w:p>
-            <w:pPr>
-              <w:spacing w:before="0" w:after="40" w:line="252" w:lineRule="auto"/>
-            </w:pPr>
-            <w:r>
-              <w:rPr>
-                <w:rFonts w:ascii="Calibri" w:hAnsi="Calibri"/>
-                <w:color w:val="000000"/>
-                <w:sz w:val="18"/>
-              </w:rPr>
-              <w:t>Tag for Update / Remove Tag</w:t>
-            </w:r>
-          </w:p>
-        </w:tc>
-        <w:tc>
-          <w:tcPr>
-            <w:tcW w:type="dxa" w:w="6860"/>
-            <w:tcMar>
-              <w:top w:w="80" w:type="dxa"/>
-              <w:start w:w="120" w:type="dxa"/>
-              <w:bottom w:w="80" w:type="dxa"/>
-              <w:end w:w="120" w:type="dxa"/>
-            </w:tcMar>
-            <w:vAlign w:val="center"/>
-          </w:tcPr>
-          <w:p>
-            <w:pPr>
-              <w:spacing w:before="0" w:after="40" w:line="252" w:lineRule="auto"/>
-            </w:pPr>
-            <w:r>
-              <w:rPr>
-                <w:rFonts w:ascii="Calibri" w:hAnsi="Calibri"/>
-                <w:color w:val="000000"/>
-                <w:sz w:val="18"/>
-              </w:rPr>
-              <w:t>On the Radar tab, applies Track Update eligibility to the selected confirmed track.</w:t>
+        <w:tc>
+          <w:tcPr>
+            <w:tcW w:type="dxa" w:w="1900"/>
+            <w:vAlign w:val="center"/>
+            <w:tcMar>
+              <w:top w:w="90" w:type="dxa"/>
+              <w:start w:w="120" w:type="dxa"/>
+              <w:bottom w:w="90" w:type="dxa"/>
+              <w:end w:w="120" w:type="dxa"/>
+            </w:tcMar>
+          </w:tcPr>
+          <w:p>
+            <w:pPr>
+              <w:spacing w:after="0"/>
+            </w:pPr>
+            <w:r>
+              <w:t>Description</w:t>
+            </w:r>
+          </w:p>
+        </w:tc>
+        <w:tc>
+          <w:tcPr>
+            <w:tcW w:type="dxa" w:w="7460"/>
+            <w:vAlign w:val="center"/>
+            <w:tcMar>
+              <w:top w:w="90" w:type="dxa"/>
+              <w:start w:w="120" w:type="dxa"/>
+              <w:bottom w:w="90" w:type="dxa"/>
+              <w:end w:w="120" w:type="dxa"/>
+            </w:tcMar>
+          </w:tcPr>
+          <w:p>
+            <w:pPr>
+              <w:spacing w:after="0"/>
+            </w:pPr>
+            <w:r>
+              <w:t>Free-text operational intent, constraints, warnings, and approval notes.</w:t>
             </w:r>
           </w:p>
         </w:tc>
       </w:tr>
     </w:tbl>
     <w:p>
+      <w:pPr/>
+      <w:r>
+        <w:t>The state indication at the lower right identifies the authority of the displayed data. DRAFT means the page is editable and is not controlling the loaded mission. Draft edits never alter the immutable loaded snapshot. The operator must validate and then load the new snapshot before it can become eligible for execution.</w:t>
+      </w:r>
+    </w:p>
+    <w:p>
       <w:pPr>
-        <w:spacing w:after="0"/>
+        <w:pStyle w:val="Heading2"/>
+        <w:keepNext/>
       </w:pPr>
+      <w:r>
+        <w:t>8.4 Ordered primary-task list</w:t>
+      </w:r>
+    </w:p>
+    <w:p>
+      <w:pPr/>
+      <w:r>
+        <w:t>The task table is the authoritative visual ordering of primary surveillance tasks. Each row shows the execution order, enabled state, task type, duration, compact configuration summary, and validation state. Disabled tasks remain in the draft but are skipped during execution.</w:t>
+      </w:r>
+    </w:p>
+    <w:tbl>
+      <w:tblPr>
+        <w:tblStyle w:val="TableGrid"/>
+        <w:tblW w:type="dxa" w:w="9360"/>
+        <w:tblLayout w:type="fixed"/>
+        <w:tblLook w:firstColumn="1" w:firstRow="1" w:lastColumn="0" w:lastRow="0" w:noHBand="0" w:noVBand="1" w:val="04A0"/>
+        <w:tblInd w:w="0" w:type="dxa"/>
+      </w:tblPr>
+      <w:tblGrid>
+        <w:gridCol w:w="1900"/>
+        <w:gridCol w:w="7460"/>
+      </w:tblGrid>
+      <w:tr>
+        <w:trPr>
+          <w:tblHeader w:val="true"/>
+        </w:trPr>
+        <w:tc>
+          <w:tcPr>
+            <w:tcW w:type="dxa" w:w="1900"/>
+            <w:vAlign w:val="center"/>
+            <w:tcMar>
+              <w:top w:w="90" w:type="dxa"/>
+              <w:start w:w="120" w:type="dxa"/>
+              <w:bottom w:w="90" w:type="dxa"/>
+              <w:end w:w="120" w:type="dxa"/>
+            </w:tcMar>
+            <w:shd w:fill="D9E2F3"/>
+          </w:tcPr>
+          <w:p>
+            <w:pPr>
+              <w:spacing w:after="0"/>
+            </w:pPr>
+            <w:r>
+              <w:rPr>
+                <w:b/>
+              </w:rPr>
+              <w:t>Control</w:t>
+            </w:r>
+          </w:p>
+        </w:tc>
+        <w:tc>
+          <w:tcPr>
+            <w:tcW w:type="dxa" w:w="7460"/>
+            <w:vAlign w:val="center"/>
+            <w:tcMar>
+              <w:top w:w="90" w:type="dxa"/>
+              <w:start w:w="120" w:type="dxa"/>
+              <w:bottom w:w="90" w:type="dxa"/>
+              <w:end w:w="120" w:type="dxa"/>
+            </w:tcMar>
+            <w:shd w:fill="D9E2F3"/>
+          </w:tcPr>
+          <w:p>
+            <w:pPr>
+              <w:spacing w:after="0"/>
+            </w:pPr>
+            <w:r>
+              <w:rPr>
+                <w:b/>
+              </w:rPr>
+              <w:t>Behaviour</w:t>
+            </w:r>
+          </w:p>
+        </w:tc>
+      </w:tr>
+      <w:tr>
+        <w:tc>
+          <w:tcPr>
+            <w:tcW w:type="dxa" w:w="1900"/>
+            <w:vAlign w:val="center"/>
+            <w:tcMar>
+              <w:top w:w="90" w:type="dxa"/>
+              <w:start w:w="120" w:type="dxa"/>
+              <w:bottom w:w="90" w:type="dxa"/>
+              <w:end w:w="120" w:type="dxa"/>
+            </w:tcMar>
+          </w:tcPr>
+          <w:p>
+            <w:pPr>
+              <w:spacing w:after="0"/>
+            </w:pPr>
+            <w:r>
+              <w:t>+ 360</w:t>
+            </w:r>
+          </w:p>
+        </w:tc>
+        <w:tc>
+          <w:tcPr>
+            <w:tcW w:type="dxa" w:w="7460"/>
+            <w:vAlign w:val="center"/>
+            <w:tcMar>
+              <w:top w:w="90" w:type="dxa"/>
+              <w:start w:w="120" w:type="dxa"/>
+              <w:bottom w:w="90" w:type="dxa"/>
+              <w:end w:w="120" w:type="dxa"/>
+            </w:tcMar>
+          </w:tcPr>
+          <w:p>
+            <w:pPr>
+              <w:spacing w:after="0"/>
+            </w:pPr>
+            <w:r>
+              <w:t>Adds a 360 Scan task to the draft.</w:t>
+            </w:r>
+          </w:p>
+        </w:tc>
+      </w:tr>
+      <w:tr>
+        <w:tc>
+          <w:tcPr>
+            <w:tcW w:type="dxa" w:w="1900"/>
+            <w:vAlign w:val="center"/>
+            <w:tcMar>
+              <w:top w:w="90" w:type="dxa"/>
+              <w:start w:w="120" w:type="dxa"/>
+              <w:bottom w:w="90" w:type="dxa"/>
+              <w:end w:w="120" w:type="dxa"/>
+            </w:tcMar>
+          </w:tcPr>
+          <w:p>
+            <w:pPr>
+              <w:spacing w:after="0"/>
+            </w:pPr>
+            <w:r>
+              <w:t>+ Sector</w:t>
+            </w:r>
+          </w:p>
+        </w:tc>
+        <w:tc>
+          <w:tcPr>
+            <w:tcW w:type="dxa" w:w="7460"/>
+            <w:vAlign w:val="center"/>
+            <w:tcMar>
+              <w:top w:w="90" w:type="dxa"/>
+              <w:start w:w="120" w:type="dxa"/>
+              <w:bottom w:w="90" w:type="dxa"/>
+              <w:end w:w="120" w:type="dxa"/>
+            </w:tcMar>
+          </w:tcPr>
+          <w:p>
+            <w:pPr>
+              <w:spacing w:after="0"/>
+            </w:pPr>
+            <w:r>
+              <w:t>Adds a Sector Scan task to the draft.</w:t>
+            </w:r>
+          </w:p>
+        </w:tc>
+      </w:tr>
+      <w:tr>
+        <w:tc>
+          <w:tcPr>
+            <w:tcW w:type="dxa" w:w="1900"/>
+            <w:vAlign w:val="center"/>
+            <w:tcMar>
+              <w:top w:w="90" w:type="dxa"/>
+              <w:start w:w="120" w:type="dxa"/>
+              <w:bottom w:w="90" w:type="dxa"/>
+              <w:end w:w="120" w:type="dxa"/>
+            </w:tcMar>
+          </w:tcPr>
+          <w:p>
+            <w:pPr>
+              <w:spacing w:after="0"/>
+            </w:pPr>
+            <w:r>
+              <w:t>Up / Down</w:t>
+            </w:r>
+          </w:p>
+        </w:tc>
+        <w:tc>
+          <w:tcPr>
+            <w:tcW w:type="dxa" w:w="7460"/>
+            <w:vAlign w:val="center"/>
+            <w:tcMar>
+              <w:top w:w="90" w:type="dxa"/>
+              <w:start w:w="120" w:type="dxa"/>
+              <w:bottom w:w="90" w:type="dxa"/>
+              <w:end w:w="120" w:type="dxa"/>
+            </w:tcMar>
+          </w:tcPr>
+          <w:p>
+            <w:pPr>
+              <w:spacing w:after="0"/>
+            </w:pPr>
+            <w:r>
+              <w:t>Moves the selected task within the primary execution order.</w:t>
+            </w:r>
+          </w:p>
+        </w:tc>
+      </w:tr>
+      <w:tr>
+        <w:tc>
+          <w:tcPr>
+            <w:tcW w:type="dxa" w:w="1900"/>
+            <w:vAlign w:val="center"/>
+            <w:tcMar>
+              <w:top w:w="90" w:type="dxa"/>
+              <w:start w:w="120" w:type="dxa"/>
+              <w:bottom w:w="90" w:type="dxa"/>
+              <w:end w:w="120" w:type="dxa"/>
+            </w:tcMar>
+          </w:tcPr>
+          <w:p>
+            <w:pPr>
+              <w:spacing w:after="0"/>
+            </w:pPr>
+            <w:r>
+              <w:t>Duplicate</w:t>
+            </w:r>
+          </w:p>
+        </w:tc>
+        <w:tc>
+          <w:tcPr>
+            <w:tcW w:type="dxa" w:w="7460"/>
+            <w:vAlign w:val="center"/>
+            <w:tcMar>
+              <w:top w:w="90" w:type="dxa"/>
+              <w:start w:w="120" w:type="dxa"/>
+              <w:bottom w:w="90" w:type="dxa"/>
+              <w:end w:w="120" w:type="dxa"/>
+            </w:tcMar>
+          </w:tcPr>
+          <w:p>
+            <w:pPr>
+              <w:spacing w:after="0"/>
+            </w:pPr>
+            <w:r>
+              <w:t>Copies the selected task with a new task identity for rapid mission construction.</w:t>
+            </w:r>
+          </w:p>
+        </w:tc>
+      </w:tr>
+      <w:tr>
+        <w:tc>
+          <w:tcPr>
+            <w:tcW w:type="dxa" w:w="1900"/>
+            <w:vAlign w:val="center"/>
+            <w:tcMar>
+              <w:top w:w="90" w:type="dxa"/>
+              <w:start w:w="120" w:type="dxa"/>
+              <w:bottom w:w="90" w:type="dxa"/>
+              <w:end w:w="120" w:type="dxa"/>
+            </w:tcMar>
+          </w:tcPr>
+          <w:p>
+            <w:pPr>
+              <w:spacing w:after="0"/>
+            </w:pPr>
+            <w:r>
+              <w:t>Remove</w:t>
+            </w:r>
+          </w:p>
+        </w:tc>
+        <w:tc>
+          <w:tcPr>
+            <w:tcW w:type="dxa" w:w="7460"/>
+            <w:vAlign w:val="center"/>
+            <w:tcMar>
+              <w:top w:w="90" w:type="dxa"/>
+              <w:start w:w="120" w:type="dxa"/>
+              <w:bottom w:w="90" w:type="dxa"/>
+              <w:end w:w="120" w:type="dxa"/>
+            </w:tcMar>
+          </w:tcPr>
+          <w:p>
+            <w:pPr>
+              <w:spacing w:after="0"/>
+            </w:pPr>
+            <w:r>
+              <w:t>Deletes the selected draft task after the normal confirmation policy.</w:t>
+            </w:r>
+          </w:p>
+        </w:tc>
+      </w:tr>
+      <w:tr>
+        <w:tc>
+          <w:tcPr>
+            <w:tcW w:type="dxa" w:w="1900"/>
+            <w:vAlign w:val="center"/>
+            <w:tcMar>
+              <w:top w:w="90" w:type="dxa"/>
+              <w:start w:w="120" w:type="dxa"/>
+              <w:bottom w:w="90" w:type="dxa"/>
+              <w:end w:w="120" w:type="dxa"/>
+            </w:tcMar>
+          </w:tcPr>
+          <w:p>
+            <w:pPr>
+              <w:spacing w:after="0"/>
+            </w:pPr>
+            <w:r>
+              <w:t>Enabled</w:t>
+            </w:r>
+          </w:p>
+        </w:tc>
+        <w:tc>
+          <w:tcPr>
+            <w:tcW w:type="dxa" w:w="7460"/>
+            <w:vAlign w:val="center"/>
+            <w:tcMar>
+              <w:top w:w="90" w:type="dxa"/>
+              <w:start w:w="120" w:type="dxa"/>
+              <w:bottom w:w="90" w:type="dxa"/>
+              <w:end w:w="120" w:type="dxa"/>
+            </w:tcMar>
+          </w:tcPr>
+          <w:p>
+            <w:pPr>
+              <w:spacing w:after="0"/>
+            </w:pPr>
+            <w:r>
+              <w:t>Includes or excludes the task without deleting its configuration.</w:t>
+            </w:r>
+          </w:p>
+        </w:tc>
+      </w:tr>
+    </w:tbl>
+    <w:p>
+      <w:pPr/>
+      <w:r>
+        <w:t>Track Update is not inserted as a fixed row in the primary list. It is a mission-wide interrupt policy that may pre-empt either primary task at a safe CPI boundary, as defined in Section 5.</w:t>
+      </w:r>
+    </w:p>
+    <w:p>
+      <w:pPr>
+        <w:pStyle w:val="Heading2"/>
+        <w:keepNext/>
+      </w:pPr>
+      <w:r>
+        <w:t>8.5 Selected primary-task editor</w:t>
+      </w:r>
+    </w:p>
+    <w:p>
+      <w:pPr/>
+      <w:r>
+        <w:t>Selecting a task row opens its editor in the right-hand pane. The header identifies the task type, task ID, validation state, and enabled state. The pane is scrollable so the display can retain the established two-column Mission layout at the target screen resolution.</w:t>
+      </w:r>
+    </w:p>
+    <w:tbl>
+      <w:tblPr>
+        <w:tblStyle w:val="TableGrid"/>
+        <w:tblW w:type="dxa" w:w="9360"/>
+        <w:tblLayout w:type="fixed"/>
+        <w:tblLook w:firstColumn="1" w:firstRow="1" w:lastColumn="0" w:lastRow="0" w:noHBand="0" w:noVBand="1" w:val="04A0"/>
+        <w:tblInd w:w="0" w:type="dxa"/>
+      </w:tblPr>
+      <w:tblGrid>
+        <w:gridCol w:w="1950"/>
+        <w:gridCol w:w="3705"/>
+        <w:gridCol w:w="3705"/>
+      </w:tblGrid>
+      <w:tr>
+        <w:trPr>
+          <w:tblHeader w:val="true"/>
+        </w:trPr>
+        <w:tc>
+          <w:tcPr>
+            <w:tcW w:type="dxa" w:w="1950"/>
+            <w:vAlign w:val="center"/>
+            <w:tcMar>
+              <w:top w:w="90" w:type="dxa"/>
+              <w:start w:w="120" w:type="dxa"/>
+              <w:bottom w:w="90" w:type="dxa"/>
+              <w:end w:w="120" w:type="dxa"/>
+            </w:tcMar>
+            <w:shd w:fill="D9E2F3"/>
+          </w:tcPr>
+          <w:p>
+            <w:pPr>
+              <w:spacing w:after="0"/>
+            </w:pPr>
+            <w:r>
+              <w:rPr>
+                <w:b/>
+              </w:rPr>
+              <w:t>Control group</w:t>
+            </w:r>
+          </w:p>
+        </w:tc>
+        <w:tc>
+          <w:tcPr>
+            <w:tcW w:type="dxa" w:w="3705"/>
+            <w:vAlign w:val="center"/>
+            <w:tcMar>
+              <w:top w:w="90" w:type="dxa"/>
+              <w:start w:w="120" w:type="dxa"/>
+              <w:bottom w:w="90" w:type="dxa"/>
+              <w:end w:w="120" w:type="dxa"/>
+            </w:tcMar>
+            <w:shd w:fill="D9E2F3"/>
+          </w:tcPr>
+          <w:p>
+            <w:pPr>
+              <w:spacing w:after="0"/>
+            </w:pPr>
+            <w:r>
+              <w:rPr>
+                <w:b/>
+              </w:rPr>
+              <w:t>360 Scan</w:t>
+            </w:r>
+          </w:p>
+        </w:tc>
+        <w:tc>
+          <w:tcPr>
+            <w:tcW w:type="dxa" w:w="3705"/>
+            <w:vAlign w:val="center"/>
+            <w:tcMar>
+              <w:top w:w="90" w:type="dxa"/>
+              <w:start w:w="120" w:type="dxa"/>
+              <w:bottom w:w="90" w:type="dxa"/>
+              <w:end w:w="120" w:type="dxa"/>
+            </w:tcMar>
+            <w:shd w:fill="D9E2F3"/>
+          </w:tcPr>
+          <w:p>
+            <w:pPr>
+              <w:spacing w:after="0"/>
+            </w:pPr>
+            <w:r>
+              <w:rPr>
+                <w:b/>
+              </w:rPr>
+              <w:t>Sector Scan</w:t>
+            </w:r>
+          </w:p>
+        </w:tc>
+      </w:tr>
+      <w:tr>
+        <w:tc>
+          <w:tcPr>
+            <w:tcW w:type="dxa" w:w="1950"/>
+            <w:vAlign w:val="center"/>
+            <w:tcMar>
+              <w:top w:w="90" w:type="dxa"/>
+              <w:start w:w="120" w:type="dxa"/>
+              <w:bottom w:w="90" w:type="dxa"/>
+              <w:end w:w="120" w:type="dxa"/>
+            </w:tcMar>
+          </w:tcPr>
+          <w:p>
+            <w:pPr>
+              <w:spacing w:after="0"/>
+            </w:pPr>
+            <w:r>
+              <w:t>Common identity and timing</w:t>
+            </w:r>
+          </w:p>
+        </w:tc>
+        <w:tc>
+          <w:tcPr>
+            <w:tcW w:type="dxa" w:w="3705"/>
+            <w:vAlign w:val="center"/>
+            <w:tcMar>
+              <w:top w:w="90" w:type="dxa"/>
+              <w:start w:w="120" w:type="dxa"/>
+              <w:bottom w:w="90" w:type="dxa"/>
+              <w:end w:w="120" w:type="dxa"/>
+            </w:tcMar>
+          </w:tcPr>
+          <w:p>
+            <w:pPr>
+              <w:spacing w:after="0"/>
+            </w:pPr>
+            <w:r>
+              <w:t>Name; duration/continuous mode; repeat/periodic setting.</w:t>
+            </w:r>
+          </w:p>
+        </w:tc>
+        <w:tc>
+          <w:tcPr>
+            <w:tcW w:type="dxa" w:w="3705"/>
+            <w:vAlign w:val="center"/>
+            <w:tcMar>
+              <w:top w:w="90" w:type="dxa"/>
+              <w:start w:w="120" w:type="dxa"/>
+              <w:bottom w:w="90" w:type="dxa"/>
+              <w:end w:w="120" w:type="dxa"/>
+            </w:tcMar>
+          </w:tcPr>
+          <w:p>
+            <w:pPr>
+              <w:spacing w:after="0"/>
+            </w:pPr>
+            <w:r>
+              <w:t>Name; duration/continuous mode; repeat/periodic setting.</w:t>
+            </w:r>
+          </w:p>
+        </w:tc>
+      </w:tr>
+      <w:tr>
+        <w:tc>
+          <w:tcPr>
+            <w:tcW w:type="dxa" w:w="1950"/>
+            <w:vAlign w:val="center"/>
+            <w:tcMar>
+              <w:top w:w="90" w:type="dxa"/>
+              <w:start w:w="120" w:type="dxa"/>
+              <w:bottom w:w="90" w:type="dxa"/>
+              <w:end w:w="120" w:type="dxa"/>
+            </w:tcMar>
+          </w:tcPr>
+          <w:p>
+            <w:pPr>
+              <w:spacing w:after="0"/>
+            </w:pPr>
+            <w:r>
+              <w:t>Radar profile</w:t>
+            </w:r>
+          </w:p>
+        </w:tc>
+        <w:tc>
+          <w:tcPr>
+            <w:tcW w:type="dxa" w:w="3705"/>
+            <w:vAlign w:val="center"/>
+            <w:tcMar>
+              <w:top w:w="90" w:type="dxa"/>
+              <w:start w:w="120" w:type="dxa"/>
+              <w:bottom w:w="90" w:type="dxa"/>
+              <w:end w:w="120" w:type="dxa"/>
+            </w:tcMar>
+          </w:tcPr>
+          <w:p>
+            <w:pPr>
+              <w:spacing w:after="0"/>
+            </w:pPr>
+            <w:r>
+              <w:t>Waveform; PRF; pulses/CPI; maximum range.</w:t>
+            </w:r>
+          </w:p>
+        </w:tc>
+        <w:tc>
+          <w:tcPr>
+            <w:tcW w:type="dxa" w:w="3705"/>
+            <w:vAlign w:val="center"/>
+            <w:tcMar>
+              <w:top w:w="90" w:type="dxa"/>
+              <w:start w:w="120" w:type="dxa"/>
+              <w:bottom w:w="90" w:type="dxa"/>
+              <w:end w:w="120" w:type="dxa"/>
+            </w:tcMar>
+          </w:tcPr>
+          <w:p>
+            <w:pPr>
+              <w:spacing w:after="0"/>
+            </w:pPr>
+            <w:r>
+              <w:t>Waveform; PRF; pulses/CPI; maximum range.</w:t>
+            </w:r>
+          </w:p>
+        </w:tc>
+      </w:tr>
+      <w:tr>
+        <w:tc>
+          <w:tcPr>
+            <w:tcW w:type="dxa" w:w="1950"/>
+            <w:vAlign w:val="center"/>
+            <w:tcMar>
+              <w:top w:w="90" w:type="dxa"/>
+              <w:start w:w="120" w:type="dxa"/>
+              <w:bottom w:w="90" w:type="dxa"/>
+              <w:end w:w="120" w:type="dxa"/>
+            </w:tcMar>
+          </w:tcPr>
+          <w:p>
+            <w:pPr>
+              <w:spacing w:after="0"/>
+            </w:pPr>
+            <w:r>
+              <w:t>Motion</w:t>
+            </w:r>
+          </w:p>
+        </w:tc>
+        <w:tc>
+          <w:tcPr>
+            <w:tcW w:type="dxa" w:w="3705"/>
+            <w:vAlign w:val="center"/>
+            <w:tcMar>
+              <w:top w:w="90" w:type="dxa"/>
+              <w:start w:w="120" w:type="dxa"/>
+              <w:bottom w:w="90" w:type="dxa"/>
+              <w:end w:w="120" w:type="dxa"/>
+            </w:tcMar>
+          </w:tcPr>
+          <w:p>
+            <w:pPr>
+              <w:spacing w:after="0"/>
+            </w:pPr>
+            <w:r>
+              <w:t>CW/CCW direction and commanded rotation in RPM.</w:t>
+            </w:r>
+          </w:p>
+        </w:tc>
+        <w:tc>
+          <w:tcPr>
+            <w:tcW w:type="dxa" w:w="3705"/>
+            <w:vAlign w:val="center"/>
+            <w:tcMar>
+              <w:top w:w="90" w:type="dxa"/>
+              <w:start w:w="120" w:type="dxa"/>
+              <w:bottom w:w="90" w:type="dxa"/>
+              <w:end w:w="120" w:type="dxa"/>
+            </w:tcMar>
+          </w:tcPr>
+          <w:p>
+            <w:pPr>
+              <w:spacing w:after="0"/>
+            </w:pPr>
+            <w:r>
+              <w:t>Start/stop bearing, initial direction, and commanded scan rate in deg/s.</w:t>
+            </w:r>
+          </w:p>
+        </w:tc>
+      </w:tr>
+      <w:tr>
+        <w:tc>
+          <w:tcPr>
+            <w:tcW w:type="dxa" w:w="1950"/>
+            <w:vAlign w:val="center"/>
+            <w:tcMar>
+              <w:top w:w="90" w:type="dxa"/>
+              <w:start w:w="120" w:type="dxa"/>
+              <w:bottom w:w="90" w:type="dxa"/>
+              <w:end w:w="120" w:type="dxa"/>
+            </w:tcMar>
+          </w:tcPr>
+          <w:p>
+            <w:pPr>
+              <w:spacing w:after="0"/>
+            </w:pPr>
+            <w:r>
+              <w:t>Derived summary</w:t>
+            </w:r>
+          </w:p>
+        </w:tc>
+        <w:tc>
+          <w:tcPr>
+            <w:tcW w:type="dxa" w:w="3705"/>
+            <w:vAlign w:val="center"/>
+            <w:tcMar>
+              <w:top w:w="90" w:type="dxa"/>
+              <w:start w:w="120" w:type="dxa"/>
+              <w:bottom w:w="90" w:type="dxa"/>
+              <w:end w:w="120" w:type="dxa"/>
+            </w:tcMar>
+          </w:tcPr>
+          <w:p>
+            <w:pPr>
+              <w:spacing w:after="0"/>
+            </w:pPr>
+            <w:r>
+              <w:t>Direction, RPM, waveform, PRF, and CPI size.</w:t>
+            </w:r>
+          </w:p>
+        </w:tc>
+        <w:tc>
+          <w:tcPr>
+            <w:tcW w:type="dxa" w:w="3705"/>
+            <w:vAlign w:val="center"/>
+            <w:tcMar>
+              <w:top w:w="90" w:type="dxa"/>
+              <w:start w:w="120" w:type="dxa"/>
+              <w:bottom w:w="90" w:type="dxa"/>
+              <w:end w:w="120" w:type="dxa"/>
+            </w:tcMar>
+          </w:tcPr>
+          <w:p>
+            <w:pPr>
+              <w:spacing w:after="0"/>
+            </w:pPr>
+            <w:r>
+              <w:t>Sector, direction, scan rate, waveform, timing, and repeat interval.</w:t>
+            </w:r>
+          </w:p>
+        </w:tc>
+      </w:tr>
+    </w:tbl>
+    <w:p>
+      <w:pPr/>
+      <w:r>
+        <w:t>Common radar controls are constrained by the verified waveform and timing configuration. At the current baseline, maximum range is limited to 15 km, PRF is constrained to the verified 1-4 kHz range, and the selected waveform identifier includes its operating chip rate.</w:t>
+      </w:r>
+    </w:p>
+    <w:p>
+      <w:pPr>
+        <w:pStyle w:val="Heading2"/>
+        <w:keepNext/>
+      </w:pPr>
+      <w:r>
+        <w:t>8.6 Validation and derived information</w:t>
+      </w:r>
+    </w:p>
+    <w:p>
+      <w:pPr/>
+      <w:r>
+        <w:t>Validation is explicit. The Validation column provides a per-task state, while the lower results pane reports structured messages using Severity, Field, and Message. The initial DRAFT message instructs the operator to validate and confirms that draft edits do not affect the loaded snapshot.</w:t>
+      </w:r>
+    </w:p>
+    <w:tbl>
+      <w:tblPr>
+        <w:tblStyle w:val="TableGrid"/>
+        <w:tblW w:type="dxa" w:w="9360"/>
+        <w:tblLayout w:type="fixed"/>
+        <w:tblLook w:firstColumn="1" w:firstRow="1" w:lastColumn="0" w:lastRow="0" w:noHBand="0" w:noVBand="1" w:val="04A0"/>
+        <w:tblInd w:w="0" w:type="dxa"/>
+      </w:tblPr>
+      <w:tblGrid>
+        <w:gridCol w:w="1900"/>
+        <w:gridCol w:w="7460"/>
+      </w:tblGrid>
+      <w:tr>
+        <w:trPr>
+          <w:tblHeader w:val="true"/>
+        </w:trPr>
+        <w:tc>
+          <w:tcPr>
+            <w:tcW w:type="dxa" w:w="1900"/>
+            <w:vAlign w:val="center"/>
+            <w:tcMar>
+              <w:top w:w="90" w:type="dxa"/>
+              <w:start w:w="120" w:type="dxa"/>
+              <w:bottom w:w="90" w:type="dxa"/>
+              <w:end w:w="120" w:type="dxa"/>
+            </w:tcMar>
+            <w:shd w:fill="D9E2F3"/>
+          </w:tcPr>
+          <w:p>
+            <w:pPr>
+              <w:spacing w:after="0"/>
+            </w:pPr>
+            <w:r>
+              <w:rPr>
+                <w:b/>
+              </w:rPr>
+              <w:t>Severity</w:t>
+            </w:r>
+          </w:p>
+        </w:tc>
+        <w:tc>
+          <w:tcPr>
+            <w:tcW w:type="dxa" w:w="7460"/>
+            <w:vAlign w:val="center"/>
+            <w:tcMar>
+              <w:top w:w="90" w:type="dxa"/>
+              <w:start w:w="120" w:type="dxa"/>
+              <w:bottom w:w="90" w:type="dxa"/>
+              <w:end w:w="120" w:type="dxa"/>
+            </w:tcMar>
+            <w:shd w:fill="D9E2F3"/>
+          </w:tcPr>
+          <w:p>
+            <w:pPr>
+              <w:spacing w:after="0"/>
+            </w:pPr>
+            <w:r>
+              <w:rPr>
+                <w:b/>
+              </w:rPr>
+              <w:t>Presentation and effect</w:t>
+            </w:r>
+          </w:p>
+        </w:tc>
+      </w:tr>
+      <w:tr>
+        <w:tc>
+          <w:tcPr>
+            <w:tcW w:type="dxa" w:w="1900"/>
+            <w:vAlign w:val="center"/>
+            <w:tcMar>
+              <w:top w:w="90" w:type="dxa"/>
+              <w:start w:w="120" w:type="dxa"/>
+              <w:bottom w:w="90" w:type="dxa"/>
+              <w:end w:w="120" w:type="dxa"/>
+            </w:tcMar>
+          </w:tcPr>
+          <w:p>
+            <w:pPr>
+              <w:spacing w:after="0"/>
+            </w:pPr>
+            <w:r>
+              <w:t>INFO</w:t>
+            </w:r>
+          </w:p>
+        </w:tc>
+        <w:tc>
+          <w:tcPr>
+            <w:tcW w:type="dxa" w:w="7460"/>
+            <w:vAlign w:val="center"/>
+            <w:tcMar>
+              <w:top w:w="90" w:type="dxa"/>
+              <w:start w:w="120" w:type="dxa"/>
+              <w:bottom w:w="90" w:type="dxa"/>
+              <w:end w:w="120" w:type="dxa"/>
+            </w:tcMar>
+          </w:tcPr>
+          <w:p>
+            <w:pPr>
+              <w:spacing w:after="0"/>
+            </w:pPr>
+            <w:r>
+              <w:t>Neutral result, derived value, or operating note; does not block loading.</w:t>
+            </w:r>
+          </w:p>
+        </w:tc>
+      </w:tr>
+      <w:tr>
+        <w:tc>
+          <w:tcPr>
+            <w:tcW w:type="dxa" w:w="1900"/>
+            <w:vAlign w:val="center"/>
+            <w:tcMar>
+              <w:top w:w="90" w:type="dxa"/>
+              <w:start w:w="120" w:type="dxa"/>
+              <w:bottom w:w="90" w:type="dxa"/>
+              <w:end w:w="120" w:type="dxa"/>
+            </w:tcMar>
+          </w:tcPr>
+          <w:p>
+            <w:pPr>
+              <w:spacing w:after="0"/>
+            </w:pPr>
+            <w:r>
+              <w:t>WARNING</w:t>
+            </w:r>
+          </w:p>
+        </w:tc>
+        <w:tc>
+          <w:tcPr>
+            <w:tcW w:type="dxa" w:w="7460"/>
+            <w:vAlign w:val="center"/>
+            <w:tcMar>
+              <w:top w:w="90" w:type="dxa"/>
+              <w:start w:w="120" w:type="dxa"/>
+              <w:bottom w:w="90" w:type="dxa"/>
+              <w:end w:w="120" w:type="dxa"/>
+            </w:tcMar>
+          </w:tcPr>
+          <w:p>
+            <w:pPr>
+              <w:spacing w:after="0"/>
+            </w:pPr>
+            <w:r>
+              <w:t>Amber caution tied to a field or task; acknowledgement policy determines whether loading is allowed.</w:t>
+            </w:r>
+          </w:p>
+        </w:tc>
+      </w:tr>
+      <w:tr>
+        <w:tc>
+          <w:tcPr>
+            <w:tcW w:type="dxa" w:w="1900"/>
+            <w:vAlign w:val="center"/>
+            <w:tcMar>
+              <w:top w:w="90" w:type="dxa"/>
+              <w:start w:w="120" w:type="dxa"/>
+              <w:bottom w:w="90" w:type="dxa"/>
+              <w:end w:w="120" w:type="dxa"/>
+            </w:tcMar>
+          </w:tcPr>
+          <w:p>
+            <w:pPr>
+              <w:spacing w:after="0"/>
+            </w:pPr>
+            <w:r>
+              <w:t>ERROR</w:t>
+            </w:r>
+          </w:p>
+        </w:tc>
+        <w:tc>
+          <w:tcPr>
+            <w:tcW w:type="dxa" w:w="7460"/>
+            <w:vAlign w:val="center"/>
+            <w:tcMar>
+              <w:top w:w="90" w:type="dxa"/>
+              <w:start w:w="120" w:type="dxa"/>
+              <w:bottom w:w="90" w:type="dxa"/>
+              <w:end w:w="120" w:type="dxa"/>
+            </w:tcMar>
+          </w:tcPr>
+          <w:p>
+            <w:pPr>
+              <w:spacing w:after="0"/>
+            </w:pPr>
+            <w:r>
+              <w:t>Invalid or unsafe configuration; Validate or Load Mission remains unavailable until corrected.</w:t>
+            </w:r>
+          </w:p>
+        </w:tc>
+      </w:tr>
+      <w:tr>
+        <w:tc>
+          <w:tcPr>
+            <w:tcW w:type="dxa" w:w="1900"/>
+            <w:vAlign w:val="center"/>
+            <w:tcMar>
+              <w:top w:w="90" w:type="dxa"/>
+              <w:start w:w="120" w:type="dxa"/>
+              <w:bottom w:w="90" w:type="dxa"/>
+              <w:end w:w="120" w:type="dxa"/>
+            </w:tcMar>
+          </w:tcPr>
+          <w:p>
+            <w:pPr>
+              <w:spacing w:after="0"/>
+            </w:pPr>
+            <w:r>
+              <w:t>LIVE FAULT</w:t>
+            </w:r>
+          </w:p>
+        </w:tc>
+        <w:tc>
+          <w:tcPr>
+            <w:tcW w:type="dxa" w:w="7460"/>
+            <w:vAlign w:val="center"/>
+            <w:tcMar>
+              <w:top w:w="90" w:type="dxa"/>
+              <w:start w:w="120" w:type="dxa"/>
+              <w:bottom w:w="90" w:type="dxa"/>
+              <w:end w:w="120" w:type="dxa"/>
+            </w:tcMar>
+          </w:tcPr>
+          <w:p>
+            <w:pPr>
+              <w:spacing w:after="0"/>
+            </w:pPr>
+            <w:r>
+              <w:t>Persistent operational fault; start is inhibited or the running mission is safely stopped.</w:t>
+            </w:r>
+          </w:p>
+        </w:tc>
+      </w:tr>
+    </w:tbl>
+    <w:p>
+      <w:pPr/>
+      <w:r>
+        <w:t>The validator is also responsible for presenting derived timing and coverage information, including CPI duration, pulse interval, antenna travel during a CPI, revolution or sector traverse time, expected revisit period, and any coverage gaps or hardware-limit violations.</w:t>
+      </w:r>
+    </w:p>
+    <w:p>
+      <w:pPr>
+        <w:pStyle w:val="Heading2"/>
+        <w:keepNext/>
+      </w:pPr>
+      <w:r>
+        <w:t>8.7 Mission lifecycle controls and operator workflow</w:t>
+      </w:r>
+    </w:p>
+    <w:tbl>
+      <w:tblPr>
+        <w:tblStyle w:val="TableGrid"/>
+        <w:tblW w:type="dxa" w:w="9360"/>
+        <w:tblLayout w:type="fixed"/>
+        <w:tblLook w:firstColumn="1" w:firstRow="1" w:lastColumn="0" w:lastRow="0" w:noHBand="0" w:noVBand="1" w:val="04A0"/>
+        <w:tblInd w:w="0" w:type="dxa"/>
+      </w:tblPr>
+      <w:tblGrid>
+        <w:gridCol w:w="1900"/>
+        <w:gridCol w:w="7460"/>
+      </w:tblGrid>
+      <w:tr>
+        <w:trPr>
+          <w:tblHeader w:val="true"/>
+        </w:trPr>
+        <w:tc>
+          <w:tcPr>
+            <w:tcW w:type="dxa" w:w="1900"/>
+            <w:vAlign w:val="center"/>
+            <w:tcMar>
+              <w:top w:w="90" w:type="dxa"/>
+              <w:start w:w="120" w:type="dxa"/>
+              <w:bottom w:w="90" w:type="dxa"/>
+              <w:end w:w="120" w:type="dxa"/>
+            </w:tcMar>
+            <w:shd w:fill="D9E2F3"/>
+          </w:tcPr>
+          <w:p>
+            <w:pPr>
+              <w:spacing w:after="0"/>
+            </w:pPr>
+            <w:r>
+              <w:rPr>
+                <w:b/>
+              </w:rPr>
+              <w:t>Control</w:t>
+            </w:r>
+          </w:p>
+        </w:tc>
+        <w:tc>
+          <w:tcPr>
+            <w:tcW w:type="dxa" w:w="7460"/>
+            <w:vAlign w:val="center"/>
+            <w:tcMar>
+              <w:top w:w="90" w:type="dxa"/>
+              <w:start w:w="120" w:type="dxa"/>
+              <w:bottom w:w="90" w:type="dxa"/>
+              <w:end w:w="120" w:type="dxa"/>
+            </w:tcMar>
+            <w:shd w:fill="D9E2F3"/>
+          </w:tcPr>
+          <w:p>
+            <w:pPr>
+              <w:spacing w:after="0"/>
+            </w:pPr>
+            <w:r>
+              <w:rPr>
+                <w:b/>
+              </w:rPr>
+              <w:t>Behaviour</w:t>
+            </w:r>
+          </w:p>
+        </w:tc>
+      </w:tr>
+      <w:tr>
+        <w:tc>
+          <w:tcPr>
+            <w:tcW w:type="dxa" w:w="1900"/>
+            <w:vAlign w:val="center"/>
+            <w:tcMar>
+              <w:top w:w="90" w:type="dxa"/>
+              <w:start w:w="120" w:type="dxa"/>
+              <w:bottom w:w="90" w:type="dxa"/>
+              <w:end w:w="120" w:type="dxa"/>
+            </w:tcMar>
+          </w:tcPr>
+          <w:p>
+            <w:pPr>
+              <w:spacing w:after="0"/>
+            </w:pPr>
+            <w:r>
+              <w:t>New</w:t>
+            </w:r>
+          </w:p>
+        </w:tc>
+        <w:tc>
+          <w:tcPr>
+            <w:tcW w:type="dxa" w:w="7460"/>
+            <w:vAlign w:val="center"/>
+            <w:tcMar>
+              <w:top w:w="90" w:type="dxa"/>
+              <w:start w:w="120" w:type="dxa"/>
+              <w:bottom w:w="90" w:type="dxa"/>
+              <w:end w:w="120" w:type="dxa"/>
+            </w:tcMar>
+          </w:tcPr>
+          <w:p>
+            <w:pPr>
+              <w:spacing w:after="0"/>
+            </w:pPr>
+            <w:r>
+              <w:t>Creates a new editable draft profile.</w:t>
+            </w:r>
+          </w:p>
+        </w:tc>
+      </w:tr>
+      <w:tr>
+        <w:tc>
+          <w:tcPr>
+            <w:tcW w:type="dxa" w:w="1900"/>
+            <w:vAlign w:val="center"/>
+            <w:tcMar>
+              <w:top w:w="90" w:type="dxa"/>
+              <w:start w:w="120" w:type="dxa"/>
+              <w:bottom w:w="90" w:type="dxa"/>
+              <w:end w:w="120" w:type="dxa"/>
+            </w:tcMar>
+          </w:tcPr>
+          <w:p>
+            <w:pPr>
+              <w:spacing w:after="0"/>
+            </w:pPr>
+            <w:r>
+              <w:t>Load file</w:t>
+            </w:r>
+          </w:p>
+        </w:tc>
+        <w:tc>
+          <w:tcPr>
+            <w:tcW w:type="dxa" w:w="7460"/>
+            <w:vAlign w:val="center"/>
+            <w:tcMar>
+              <w:top w:w="90" w:type="dxa"/>
+              <w:start w:w="120" w:type="dxa"/>
+              <w:bottom w:w="90" w:type="dxa"/>
+              <w:end w:w="120" w:type="dxa"/>
+            </w:tcMar>
+          </w:tcPr>
+          <w:p>
+            <w:pPr>
+              <w:spacing w:after="0"/>
+            </w:pPr>
+            <w:r>
+              <w:t>Reads a saved mission profile into the draft editor; it does not make the profile active.</w:t>
+            </w:r>
+          </w:p>
+        </w:tc>
+      </w:tr>
+      <w:tr>
+        <w:tc>
+          <w:tcPr>
+            <w:tcW w:type="dxa" w:w="1900"/>
+            <w:vAlign w:val="center"/>
+            <w:tcMar>
+              <w:top w:w="90" w:type="dxa"/>
+              <w:start w:w="120" w:type="dxa"/>
+              <w:bottom w:w="90" w:type="dxa"/>
+              <w:end w:w="120" w:type="dxa"/>
+            </w:tcMar>
+          </w:tcPr>
+          <w:p>
+            <w:pPr>
+              <w:spacing w:after="0"/>
+            </w:pPr>
+            <w:r>
+              <w:t>Save file</w:t>
+            </w:r>
+          </w:p>
+        </w:tc>
+        <w:tc>
+          <w:tcPr>
+            <w:tcW w:type="dxa" w:w="7460"/>
+            <w:vAlign w:val="center"/>
+            <w:tcMar>
+              <w:top w:w="90" w:type="dxa"/>
+              <w:start w:w="120" w:type="dxa"/>
+              <w:bottom w:w="90" w:type="dxa"/>
+              <w:end w:w="120" w:type="dxa"/>
+            </w:tcMar>
+          </w:tcPr>
+          <w:p>
+            <w:pPr>
+              <w:spacing w:after="0"/>
+            </w:pPr>
+            <w:r>
+              <w:t>Writes the current draft profile to a mission file.</w:t>
+            </w:r>
+          </w:p>
+        </w:tc>
+      </w:tr>
+      <w:tr>
+        <w:tc>
+          <w:tcPr>
+            <w:tcW w:type="dxa" w:w="1900"/>
+            <w:vAlign w:val="center"/>
+            <w:tcMar>
+              <w:top w:w="90" w:type="dxa"/>
+              <w:start w:w="120" w:type="dxa"/>
+              <w:bottom w:w="90" w:type="dxa"/>
+              <w:end w:w="120" w:type="dxa"/>
+            </w:tcMar>
+          </w:tcPr>
+          <w:p>
+            <w:pPr>
+              <w:spacing w:after="0"/>
+            </w:pPr>
+            <w:r>
+              <w:t>Validate Mission</w:t>
+            </w:r>
+          </w:p>
+        </w:tc>
+        <w:tc>
+          <w:tcPr>
+            <w:tcW w:type="dxa" w:w="7460"/>
+            <w:vAlign w:val="center"/>
+            <w:tcMar>
+              <w:top w:w="90" w:type="dxa"/>
+              <w:start w:w="120" w:type="dxa"/>
+              <w:bottom w:w="90" w:type="dxa"/>
+              <w:end w:w="120" w:type="dxa"/>
+            </w:tcMar>
+          </w:tcPr>
+          <w:p>
+            <w:pPr>
+              <w:spacing w:after="0"/>
+            </w:pPr>
+            <w:r>
+              <w:t>Runs static configuration, timing, motion, and coverage checks and records the results.</w:t>
+            </w:r>
+          </w:p>
+        </w:tc>
+      </w:tr>
+      <w:tr>
+        <w:tc>
+          <w:tcPr>
+            <w:tcW w:type="dxa" w:w="1900"/>
+            <w:vAlign w:val="center"/>
+            <w:tcMar>
+              <w:top w:w="90" w:type="dxa"/>
+              <w:start w:w="120" w:type="dxa"/>
+              <w:bottom w:w="90" w:type="dxa"/>
+              <w:end w:w="120" w:type="dxa"/>
+            </w:tcMar>
+          </w:tcPr>
+          <w:p>
+            <w:pPr>
+              <w:spacing w:after="0"/>
+            </w:pPr>
+            <w:r>
+              <w:t>Load Mission</w:t>
+            </w:r>
+          </w:p>
+        </w:tc>
+        <w:tc>
+          <w:tcPr>
+            <w:tcW w:type="dxa" w:w="7460"/>
+            <w:vAlign w:val="center"/>
+            <w:tcMar>
+              <w:top w:w="90" w:type="dxa"/>
+              <w:start w:w="120" w:type="dxa"/>
+              <w:bottom w:w="90" w:type="dxa"/>
+              <w:end w:w="120" w:type="dxa"/>
+            </w:tcMar>
+          </w:tcPr>
+          <w:p>
+            <w:pPr>
+              <w:spacing w:after="0"/>
+            </w:pPr>
+            <w:r>
+              <w:t>Freezes the validated draft as the immutable loaded snapshot; initially allowed only while STOPPED.</w:t>
+            </w:r>
+          </w:p>
+        </w:tc>
+      </w:tr>
+      <w:tr>
+        <w:tc>
+          <w:tcPr>
+            <w:tcW w:type="dxa" w:w="1900"/>
+            <w:vAlign w:val="center"/>
+            <w:tcMar>
+              <w:top w:w="90" w:type="dxa"/>
+              <w:start w:w="120" w:type="dxa"/>
+              <w:bottom w:w="90" w:type="dxa"/>
+              <w:end w:w="120" w:type="dxa"/>
+            </w:tcMar>
+          </w:tcPr>
+          <w:p>
+            <w:pPr>
+              <w:spacing w:after="0"/>
+            </w:pPr>
+            <w:r>
+              <w:t>Start Mission</w:t>
+            </w:r>
+          </w:p>
+        </w:tc>
+        <w:tc>
+          <w:tcPr>
+            <w:tcW w:type="dxa" w:w="7460"/>
+            <w:vAlign w:val="center"/>
+            <w:tcMar>
+              <w:top w:w="90" w:type="dxa"/>
+              <w:start w:w="120" w:type="dxa"/>
+              <w:bottom w:w="90" w:type="dxa"/>
+              <w:end w:w="120" w:type="dxa"/>
+            </w:tcMar>
+          </w:tcPr>
+          <w:p>
+            <w:pPr>
+              <w:spacing w:after="0"/>
+            </w:pPr>
+            <w:r>
+              <w:t>Requests execution of the loaded snapshot after live dependency and safety checks.</w:t>
+            </w:r>
+          </w:p>
+        </w:tc>
+      </w:tr>
+      <w:tr>
+        <w:tc>
+          <w:tcPr>
+            <w:tcW w:type="dxa" w:w="1900"/>
+            <w:vAlign w:val="center"/>
+            <w:tcMar>
+              <w:top w:w="90" w:type="dxa"/>
+              <w:start w:w="120" w:type="dxa"/>
+              <w:bottom w:w="90" w:type="dxa"/>
+              <w:end w:w="120" w:type="dxa"/>
+            </w:tcMar>
+          </w:tcPr>
+          <w:p>
+            <w:pPr>
+              <w:spacing w:after="0"/>
+            </w:pPr>
+            <w:r>
+              <w:t>Pause</w:t>
+            </w:r>
+          </w:p>
+        </w:tc>
+        <w:tc>
+          <w:tcPr>
+            <w:tcW w:type="dxa" w:w="7460"/>
+            <w:vAlign w:val="center"/>
+            <w:tcMar>
+              <w:top w:w="90" w:type="dxa"/>
+              <w:start w:w="120" w:type="dxa"/>
+              <w:bottom w:w="90" w:type="dxa"/>
+              <w:end w:w="120" w:type="dxa"/>
+            </w:tcMar>
+          </w:tcPr>
+          <w:p>
+            <w:pPr>
+              <w:spacing w:after="0"/>
+            </w:pPr>
+            <w:r>
+              <w:t>Finishes the current CPI, inhibits RF, and applies the defined antenna pause policy.</w:t>
+            </w:r>
+          </w:p>
+        </w:tc>
+      </w:tr>
+      <w:tr>
+        <w:tc>
+          <w:tcPr>
+            <w:tcW w:type="dxa" w:w="1900"/>
+            <w:vAlign w:val="center"/>
+            <w:tcMar>
+              <w:top w:w="90" w:type="dxa"/>
+              <w:start w:w="120" w:type="dxa"/>
+              <w:bottom w:w="90" w:type="dxa"/>
+              <w:end w:w="120" w:type="dxa"/>
+            </w:tcMar>
+          </w:tcPr>
+          <w:p>
+            <w:pPr>
+              <w:spacing w:after="0"/>
+            </w:pPr>
+            <w:r>
+              <w:t>STOP</w:t>
+            </w:r>
+          </w:p>
+        </w:tc>
+        <w:tc>
+          <w:tcPr>
+            <w:tcW w:type="dxa" w:w="7460"/>
+            <w:vAlign w:val="center"/>
+            <w:tcMar>
+              <w:top w:w="90" w:type="dxa"/>
+              <w:start w:w="120" w:type="dxa"/>
+              <w:bottom w:w="90" w:type="dxa"/>
+              <w:end w:w="120" w:type="dxa"/>
+            </w:tcMar>
+          </w:tcPr>
+          <w:p>
+            <w:pPr>
+              <w:spacing w:after="0"/>
+            </w:pPr>
+            <w:r>
+              <w:t>Persistent safety action available on either tab; inhibits RF and commands safe motion shutdown/hold.</w:t>
+            </w:r>
+          </w:p>
+        </w:tc>
+      </w:tr>
+    </w:tbl>
+    <w:p>
+      <w:pPr/>
+      <w:r>
+        <w:t>The normal operator sequence is:</w:t>
+      </w:r>
+    </w:p>
+    <w:p>
+      <w:pPr>
+        <w:pStyle w:val="ListNumber"/>
+      </w:pPr>
+      <w:r>
+        <w:t>Create a new draft or load a mission file.</w:t>
+      </w:r>
+    </w:p>
+    <w:p>
+      <w:pPr>
+        <w:pStyle w:val="ListNumber"/>
+      </w:pPr>
+      <w:r>
+        <w:t>Edit mission identity, completion policy, task order, and task parameters.</w:t>
+      </w:r>
+    </w:p>
+    <w:p>
+      <w:pPr>
+        <w:pStyle w:val="ListNumber"/>
+      </w:pPr>
+      <w:r>
+        <w:t>Run Validate Mission and correct all blocking errors.</w:t>
+      </w:r>
+    </w:p>
+    <w:p>
+      <w:pPr>
+        <w:pStyle w:val="ListNumber"/>
+      </w:pPr>
+      <w:r>
+        <w:t>Save the draft when a reusable mission file is required.</w:t>
+      </w:r>
+    </w:p>
+    <w:p>
+      <w:pPr>
+        <w:pStyle w:val="ListNumber"/>
+      </w:pPr>
+      <w:r>
+        <w:t>While the system is stopped, select Load Mission to freeze the validated snapshot.</w:t>
+      </w:r>
+    </w:p>
+    <w:p>
+      <w:pPr>
+        <w:pStyle w:val="ListNumber"/>
+      </w:pPr>
+      <w:r>
+        <w:t>Select Start Mission; live safety, link, timing, and hardware checks must pass before execution begins.</w:t>
+      </w:r>
+    </w:p>
+    <w:p>
+      <w:pPr>
+        <w:pStyle w:val="ListNumber"/>
+      </w:pPr>
+      <w:r>
+        <w:t>Use Pause for a controlled mission pause or the persistent STOP control for immediate safe termination.</w:t>
+      </w:r>
+    </w:p>
+    <w:p>
+      <w:pPr>
+        <w:pStyle w:val="Heading2"/>
+        <w:keepNext/>
+      </w:pPr>
+      <w:r>
+        <w:t>8.8 Relationship to the Radar tab and separated UI</w:t>
+      </w:r>
+    </w:p>
+    <w:p>
+      <w:pPr/>
+      <w:r>
+        <w:t>The Mission tab expresses operator intent; it does not directly command the X6-60, Ettus, ATR, TRM, PA, or processing chain. MissionController and RadarScheduler own the loaded snapshot and runtime sequencing, PointingManager owns antenna motion, and the dwell executor owns complete radar observations.</w:t>
+      </w:r>
+    </w:p>
+    <w:p>
+      <w:pPr/>
+      <w:r>
+        <w:t>The persistent LINK state confirms the connection between the display process and the radar/scheduler process when the separated Terminal 2 configuration is used. Remote controls use the same validation and safety path as the local display. Loss of the control link must fail safe and cannot grant or retain RF authority independently of the scheduler.</w:t>
+      </w:r>
+    </w:p>
+    <w:p>
+      <w:pPr/>
+      <w:r>
+        <w:t>The persistent RF and system-mode indications remain authoritative. SIM is fully simulated. SDR Bench uses the real Ettus with timed TX/RX and active ATR while antenna motion remains simulated/disabled and the TRM/PA are disconnected. HARD is the integrated hardware context subject to its current operating restrictions. RF LOOPBACK is the separately guarded attenuated cable-loopback profile with external ATR held inactive. Selecting or editing a mission does not override any of these runtime-profile restrictions.</w:t>
+      </w:r>
     </w:p>
     <w:p>
       <w:pPr>
@@ -12160,11 +12647,7 @@
     </w:p>
     <w:p>
       <w:r>
-        <w:rPr>
-          <w:rFonts w:ascii="Calibri" w:hAnsi="Calibri"/>
-          <w:color w:val="000000"/>
-        </w:rPr>
-        <w:t>The current VanguardxMain_scheduler.py creates one persistent SearchTask and uses X6-60-specific configuration and pointing paths. RadarDisplayQt5.py builds a single QMainWindow layout with live controls beside the PPI. The mission implementation should retain the proven radar processing, timing, task, tracker, and display paths while introducing the following seams:</w:t>
+        <w:t>The current VanguardxMain_scheduler.py retains the scheduler-integrated radar path and X6-60-specific configuration and pointing paths. RadarDisplayQt5.py now presents the existing real-time PPI and the Mission editor in a QTabWidget, with a persistent system-status header visible from both tabs. The following migration seams remain relevant as mission execution and Track Update are completed:</w:t>
       </w:r>
     </w:p>
     <w:p>
@@ -12220,11 +12703,7 @@
         <w:pStyle w:val="ListBullet"/>
       </w:pPr>
       <w:r>
-        <w:rPr>
-          <w:rFonts w:ascii="Calibri" w:hAnsi="Calibri"/>
-          <w:color w:val="000000"/>
-        </w:rPr>
-        <w:t>Wrap the existing PPI central widget and the new Mission page in a QTabWidget without changing the PPI plot geometry.</w:t>
+        <w:t>Maintain the implemented QTabWidget separation between Radar and Mission while preserving the PPI and range-profile geometry.</w:t>
       </w:r>
     </w:p>
     <w:p>
@@ -13365,6 +13844,11 @@
         <w:t>12.1 Current verified timing baseline</w:t>
       </w:r>
     </w:p>
+    <w:p>
+      <w:r>
+        <w:t>Runtime mode is orthogonal to mission content. Mission profiles specify tasking, waveform, timing and motion intent, while the top-level runtime profile determines which hardware adapters and authorisations are available. A mission validated in SIM does not acquire hardware authority merely by being loaded. SDR Bench is intended for real-Ettus/CRO verification with no operational antenna motion; HARD and RF LOOPBACK retain their separate hardware and safety semantics.</w:t>
+      </w:r>
+    </w:p>
     <w:tbl>
       <w:tblPr>
         <w:tblStyle w:val="TableGrid"/>
@@ -13667,16 +14151,8 @@
             <w:vAlign w:val="center"/>
           </w:tcPr>
           <w:p>
-            <w:pPr>
-              <w:spacing w:before="0" w:after="40" w:line="252" w:lineRule="auto"/>
-            </w:pPr>
-            <w:r>
-              <w:rPr>
-                <w:rFonts w:ascii="Calibri" w:hAnsi="Calibri"/>
-                <w:color w:val="000000"/>
-                <w:sz w:val="17"/>
-              </w:rPr>
-              <w:t>1-4 kHz; default 2 kHz</w:t>
+            <w:r>
+              <w:t>1-4 kHz; current operational Golay default 4 kHz</w:t>
             </w:r>
           </w:p>
         </w:tc>
@@ -13692,16 +14168,8 @@
             <w:vAlign w:val="center"/>
           </w:tcPr>
           <w:p>
-            <w:pPr>
-              <w:spacing w:before="0" w:after="40" w:line="252" w:lineRule="auto"/>
-            </w:pPr>
-            <w:r>
-              <w:rPr>
-                <w:rFonts w:ascii="Calibri" w:hAnsi="Calibri"/>
-                <w:color w:val="000000"/>
-                <w:sz w:val="17"/>
-              </w:rPr>
-              <w:t>Mission control constrained to verified range.</w:t>
+            <w:r>
+              <w:t>Mission control constrained to the verified physical-PRF range.</w:t>
             </w:r>
           </w:p>
         </w:tc>
@@ -13747,16 +14215,8 @@
             <w:vAlign w:val="center"/>
           </w:tcPr>
           <w:p>
-            <w:pPr>
-              <w:spacing w:before="0" w:after="40" w:line="252" w:lineRule="auto"/>
-            </w:pPr>
-            <w:r>
-              <w:rPr>
-                <w:rFonts w:ascii="Calibri" w:hAnsi="Calibri"/>
-                <w:color w:val="000000"/>
-                <w:sz w:val="17"/>
-              </w:rPr>
-              <w:t>Default 32</w:t>
+            <w:r>
+              <w:t>Operational Golay default 64 physical A/B pulses</w:t>
             </w:r>
           </w:p>
         </w:tc>
@@ -13772,16 +14232,8 @@
             <w:vAlign w:val="center"/>
           </w:tcPr>
           <w:p>
-            <w:pPr>
-              <w:spacing w:before="0" w:after="40" w:line="252" w:lineRule="auto"/>
-            </w:pPr>
-            <w:r>
-              <w:rPr>
-                <w:rFonts w:ascii="Calibri" w:hAnsi="Calibri"/>
-                <w:color w:val="000000"/>
-                <w:sz w:val="17"/>
-              </w:rPr>
-              <w:t>16 ms CPI at 2 kHz.</w:t>
+            <w:r>
+              <w:t>16 ms CPI at 4 kHz; 32 complementary pair outputs.</w:t>
             </w:r>
           </w:p>
         </w:tc>
@@ -14147,16 +14599,8 @@
             <w:vAlign w:val="center"/>
           </w:tcPr>
           <w:p>
-            <w:pPr>
-              <w:spacing w:before="0" w:after="40" w:line="252" w:lineRule="auto"/>
-            </w:pPr>
-            <w:r>
-              <w:rPr>
-                <w:rFonts w:ascii="Calibri" w:hAnsi="Calibri"/>
-                <w:color w:val="000000"/>
-                <w:sz w:val="17"/>
-              </w:rPr>
-              <w:t>TX about 5 us; RX about 100 us; about 1 us guard in CRO test</w:t>
+            <w:r>
+              <w:t>Golay expected 3.40 us TX; measured 3.32 us; measured TX-to-RX guard 0.96 us; RX capture about 101 us</w:t>
             </w:r>
           </w:p>
         </w:tc>
@@ -14172,16 +14616,8 @@
             <w:vAlign w:val="center"/>
           </w:tcPr>
           <w:p>
-            <w:pPr>
-              <w:spacing w:before="0" w:after="40" w:line="252" w:lineRule="auto"/>
-            </w:pPr>
-            <w:r>
-              <w:rPr>
-                <w:rFonts w:ascii="Calibri" w:hAnsi="Calibri"/>
-                <w:color w:val="000000"/>
-                <w:sz w:val="17"/>
-              </w:rPr>
-              <w:t>RF state transitions remain governed by verified pulse-plan/ATR logic.</w:t>
+            <w:r>
+              <w:t>Verified in SDR Bench mode with TRM/PA disconnected; external TRM/receiver recovery remains to be measured.</w:t>
             </w:r>
           </w:p>
         </w:tc>
@@ -14885,6 +15321,14 @@
           <w:color w:val="000000"/>
         </w:rPr>
         <w:t>System mode and required explicit RF/motion acknowledgements are valid.</w:t>
+      </w:r>
+    </w:p>
+    <w:p>
+      <w:pPr>
+        <w:pStyle w:val="ListBullet"/>
+      </w:pPr>
+      <w:r>
+        <w:t>SDR Bench is a verification profile, not a mission RF-authority shortcut: it keeps antenna motion simulated/disabled and requires the TRM/PA disconnected.</w:t>
       </w:r>
     </w:p>
     <w:p>
@@ -17718,16 +18162,8 @@
             <w:vAlign w:val="center"/>
           </w:tcPr>
           <w:p>
-            <w:pPr>
-              <w:spacing w:before="0" w:after="40" w:line="252" w:lineRule="auto"/>
-            </w:pPr>
-            <w:r>
-              <w:rPr>
-                <w:rFonts w:ascii="Calibri" w:hAnsi="Calibri"/>
-                <w:color w:val="000000"/>
-                <w:sz w:val="16"/>
-              </w:rPr>
-              <w:t>Timed mission transitions and Track Update pre-emption with RF chain/PA disconnected as required.</w:t>
+            <w:r>
+              <w:t>Timed mission/runtime transitions and Track Update pre-emption with SDR Bench mode and the RF chain/PA disconnected as required. Golay64 baseline timing now has direct CRO evidence at the SDR/HAT interface.</w:t>
             </w:r>
           </w:p>
         </w:tc>
@@ -17743,16 +18179,8 @@
             <w:vAlign w:val="center"/>
           </w:tcPr>
           <w:p>
-            <w:pPr>
-              <w:spacing w:before="0" w:after="40" w:line="252" w:lineRule="auto"/>
-            </w:pPr>
-            <w:r>
-              <w:rPr>
-                <w:rFonts w:ascii="Calibri" w:hAnsi="Calibri"/>
-                <w:color w:val="000000"/>
-                <w:sz w:val="16"/>
-              </w:rPr>
-              <w:t>No TX ATR during motion; queue drain/cancel and RF-safe boundaries observed.</w:t>
+            <w:r>
+              <w:t>No TX ATR during motion; queue drain/cancel and RF-safe boundaries observed. Current SDR Bench evidence: approximately 3.32 us TX high and 0.96 us both-low guard.</w:t>
             </w:r>
           </w:p>
         </w:tc>
@@ -18580,6 +19008,30 @@
           </w:p>
         </w:tc>
       </w:tr>
+      <w:tr>
+        <w:tc>
+          <w:tcPr>
+            <w:tcW w:type="dxa" w:w="2500"/>
+            <w:vAlign w:val="center"/>
+          </w:tcPr>
+          <w:p>
+            <w:r>
+              <w:t>Runtime verification modes</w:t>
+            </w:r>
+          </w:p>
+        </w:tc>
+        <w:tc>
+          <w:tcPr>
+            <w:tcW w:type="dxa" w:w="6860"/>
+            <w:vAlign w:val="center"/>
+          </w:tcPr>
+          <w:p>
+            <w:r>
+              <w:t>GUI-selectable SIM, SDR, HARD and RF LOOPBACK profiles. SDR Bench uses the real Ettus with timed TX/RX and active ATR while antenna motion is simulated/disabled and the TRM/PA remain disconnected.</w:t>
+            </w:r>
+          </w:p>
+        </w:tc>
+      </w:tr>
     </w:tbl>
     <w:p>
       <w:pPr>
@@ -19566,11 +20018,7 @@
         <w:spacing w:after="160" w:line="280" w:lineRule="auto"/>
       </w:pPr>
       <w:r>
-        <w:rPr>
-          <w:rFonts w:ascii="Calibri" w:hAnsi="Calibri"/>
-          <w:color w:val="000000"/>
-        </w:rPr>
-        <w:t>Restructure RadarDisplayQt5 around a QTabWidget, placing the existing display on Radar and the new editor on Mission without changing PPI/range-profile geometry.</w:t>
+        <w:t>Retain and regression-test the implemented Radar/Mission QTabWidget without changing PPI or range-profile geometry.</w:t>
       </w:r>
     </w:p>
     <w:p>
@@ -20606,7 +21054,7 @@
         <w:color w:val="5E6B78"/>
         <w:sz w:val="17"/>
       </w:rPr>
-      <w:t xml:space="preserve">VX-MDD-001  |  Design Baseline  |  Page </w:t>
+      <w:t xml:space="preserve">VX-MDD-001  |  Revision C  |  Page </w:t>
     </w:r>
     <w:r>
       <w:rPr>

</xml_diff>